<commit_message>
Finalize research brief, progress report, and innovation analysis — update title, add database comparison matrix, FAA-Dominance analysis, and clear done vs future-work boundary
</commit_message>
<xml_diff>
--- a/paper/研究进展报告_DREAMER_NRC.docx
+++ b/paper/研究进展报告_DREAMER_NRC.docx
@@ -13,7 +13,7 @@
           <w:color w:val="B5403E"/>
           <w:sz w:val="20"/>
         </w:rPr>
-        <w:t>研究进展报告  ·  2026.07.15</w:t>
+        <w:t>研究进展报告  ·  2026.07.24</w:t>
       </w:r>
     </w:p>
     <w:p>
@@ -28,7 +28,7 @@
           <w:color w:val="202A35"/>
           <w:sz w:val="58"/>
         </w:rPr>
-        <w:t>从情绪词到诱发体验</w:t>
+        <w:t>研究进展报告</w:t>
       </w:r>
     </w:p>
     <w:p>
@@ -40,9 +40,9 @@
           <w:rFonts w:ascii="Microsoft YaHei" w:hAnsi="Microsoft YaHei" w:eastAsia="Microsoft YaHei"/>
           <w:b/>
           <w:color w:val="287B78"/>
-          <w:sz w:val="32"/>
+          <w:sz w:val="30"/>
         </w:rPr>
-        <w:t>NRC-VAD 与 DREAMER 三维情绪空间对齐研究</w:t>
+        <w:t>感情語に対する意味的評価と映像によって喚起された情動体験とのVAD次元別対応関係の検討</w:t>
       </w:r>
     </w:p>
     <w:p>
@@ -55,7 +55,7 @@
           <w:color w:val="607080"/>
           <w:sz w:val="22"/>
         </w:rPr>
-        <w:t>公共数据探索性研究完成  |  论文数据稿形成</w:t>
+        <w:t>研究题目确定  |  主分析与稳健性复核完成</w:t>
       </w:r>
     </w:p>
     <w:tbl>
@@ -267,7 +267,20 @@
         <w:rPr>
           <w:rFonts w:ascii="Microsoft YaHei" w:hAnsi="Microsoft YaHei" w:eastAsia="Microsoft YaHei"/>
         </w:rPr>
-        <w:t>本项目关注一个基础但尚未被直接回答的问题：人们对情绪词的语义理解，与观看情绪刺激时实际报告的主观体验，是否占据相似的效价（Valence）、唤醒度（Arousal）和支配感（Dominance）空间位置？原始研究方案计划在同一批参与者中采集词义联想、情绪概念原型、刺激诱发体验和生理信号，从而完成个体内直接对齐。受一个月时间、伦理审批和设备条件限制，当前阶段改用公开数据库完成方法验证和探索性分析。</w:t>
+        <w:t>本项目关注一个基础但尚未被直接回答的问题：人们对情绪词的语义理解，与观看情绪刺激时实际报告的主观体验，是否占据相似的效价（Valence）、唤醒度（Arousal）和支配感（Dominance）空间位置？这是一个</w:t>
+      </w:r>
+      <w:r>
+        <w:rPr>
+          <w:rFonts w:ascii="Microsoft YaHei" w:hAnsi="Microsoft YaHei" w:eastAsia="Microsoft YaHei"/>
+          <w:b/>
+        </w:rPr>
+        <w:t>测量边界问题</w:t>
+      </w:r>
+      <w:r>
+        <w:rPr>
+          <w:rFonts w:ascii="Microsoft YaHei" w:hAnsi="Microsoft YaHei" w:eastAsia="Microsoft YaHei"/>
+        </w:rPr>
+        <w:t>——语言中的情绪坐标能否作为体验坐标的代理？若只能部分代理，其失效发生在哪些维度和类别？</w:t>
       </w:r>
     </w:p>
     <w:p>
@@ -278,7 +291,7 @@
         <w:rPr>
           <w:rFonts w:ascii="Microsoft YaHei" w:hAnsi="Microsoft YaHei" w:eastAsia="Microsoft YaHei"/>
         </w:rPr>
-        <w:t>目前已完成 CASE 数据库的二维 VA 试跑，以及 DREAMER 数据库与 NRC-VAD v2.1 的三维 VAD 主分析。DREAMER 包含 23 名参与者观看 18 段影片后的 414 次 VAD 评分，并同步记录 EEG 与 ECG；本研究将其 9 类目标情绪与 NRC-VAD 中同名情绪名词进行配对。结果显示，跨情绪类别的效价具有很强对应关系（Pearson r=.875），唤醒度具有较强线性相关（r=.832）但排序相关不稳定，支配感没有显示可靠对应（r=-.121）。原始三维距离显示 happiness 最接近、sadness 最远；但经留一情绪线性校准后，excitement、fear 和 anger 的特异性残差最小，calmness 最大，说明原始距离同时混合了全局尺度压缩和情绪特异性偏离。粗粒度 EEG/ECG 特征未能解释试次级对齐距离，Holm 校正后均不显著。</w:t>
+        <w:t>目前已完成 CASE 数据库的二维 VA 方法试跑，DREAMER 数据库与 NRC-VAD v2.1 的三维 VAD 主分析，以及包含全部 362,880 种精确类别置换、5,000 次双层 bootstrap、逐类删除和留一情绪校准的完整稳健性复核。主要发现：Valence 呈现强且稳定的跨情境结构对应（r=.875, Holm p=.018），Arousal 具有线性对应（r=.832, Holm p=.034）但排序和类别影响较不稳定，Dominance 未发现跨情境对应（r=-.121, Holm p=.792）。DREAMER 诱发评分相对 NRC 常模存在显著量尺压缩（V 斜率 .520, A 斜率 .341）。校准后 calmness 的残差点估计最大但类别区间广泛重叠。在探索性生理分析中，包括理论上与 Dominance 相关的额叶 alpha 不对称（FAA）在内的七项 EEG/ECG 特征均未显著解释个体层面的 VAD 对齐偏差。</w:t>
       </w:r>
     </w:p>
     <w:p>
@@ -289,7 +302,7 @@
         <w:rPr>
           <w:rFonts w:ascii="Microsoft YaHei" w:hAnsi="Microsoft YaHei" w:eastAsia="Microsoft YaHei"/>
         </w:rPr>
-        <w:t>现有结果足以支撑一篇以“跨语境 VAD 对齐及其维度特异性”为主题的探索性论文，但不足以证明词义理解与诱发体验在个体内可互换，也不能据此断言 Dominance 是纯认知维度。下一阶段应集中完成稳健性分析、明确 Dominance 计分方向、补充可视化与论文写作，而不是在当前周期内另建大型人体数据库。</w:t>
+        <w:t>现有结果足以支撑一篇以”跨情境 VAD 对齐及其维度特异性”为主题的探索性论文，但不足以证明词义理解与诱发体验在个体内可互换。A2 同一参与者三层对齐实验已完成全部设计但尚未启动，需等待伦理审批、设备确认和参与者招募。</w:t>
       </w:r>
     </w:p>
     <w:p>
@@ -650,6 +663,1214 @@
     </w:p>
     <w:p>
       <w:pPr>
+        <w:pStyle w:val="Heading2"/>
+      </w:pPr>
+      <w:r>
+        <w:rPr>
+          <w:rFonts w:ascii="Microsoft YaHei" w:hAnsi="Microsoft YaHei" w:eastAsia="Microsoft YaHei"/>
+        </w:rPr>
+        <w:t>2.4 三个数据库的横向对比</w:t>
+      </w:r>
+    </w:p>
+    <w:p>
+      <w:pPr>
+        <w:ind w:firstLine="420"/>
+      </w:pPr>
+      <w:r>
+        <w:rPr>
+          <w:rFonts w:ascii="Microsoft YaHei" w:hAnsi="Microsoft YaHei" w:eastAsia="Microsoft YaHei"/>
+        </w:rPr>
+        <w:t>本研究同时使用三个公开/许可数据库，它们在测量对象、任务类型和数据特性上有本质差异。下表总结其关键特征：</w:t>
+      </w:r>
+    </w:p>
+    <w:tbl>
+      <w:tblPr>
+        <w:tblStyle w:val="TableGrid"/>
+        <w:tblW w:type="auto" w:w="0"/>
+        <w:jc w:val="center"/>
+        <w:tblLayout w:type="autofit"/>
+        <w:tblLook w:firstColumn="1" w:firstRow="1" w:lastColumn="0" w:lastRow="0" w:noHBand="0" w:noVBand="1" w:val="04A0"/>
+      </w:tblPr>
+      <w:tblGrid>
+        <w:gridCol w:w="2353"/>
+        <w:gridCol w:w="2353"/>
+        <w:gridCol w:w="2353"/>
+        <w:gridCol w:w="2353"/>
+      </w:tblGrid>
+      <w:tr>
+        <w:trPr>
+          <w:tblHeader w:val="true"/>
+        </w:trPr>
+        <w:tc>
+          <w:tcPr>
+            <w:tcW w:type="dxa" w:w="2353"/>
+            <w:vAlign w:val="center"/>
+            <w:tcMar>
+              <w:top w:w="90" w:type="dxa"/>
+              <w:start w:w="100" w:type="dxa"/>
+              <w:bottom w:w="90" w:type="dxa"/>
+              <w:end w:w="100" w:type="dxa"/>
+            </w:tcMar>
+            <w:shd w:fill="202A35"/>
+          </w:tcPr>
+          <w:p>
+            <w:pPr>
+              <w:spacing w:after="0"/>
+            </w:pPr>
+          </w:p>
+        </w:tc>
+        <w:tc>
+          <w:tcPr>
+            <w:tcW w:type="dxa" w:w="2353"/>
+            <w:vAlign w:val="center"/>
+            <w:tcMar>
+              <w:top w:w="90" w:type="dxa"/>
+              <w:start w:w="100" w:type="dxa"/>
+              <w:bottom w:w="90" w:type="dxa"/>
+              <w:end w:w="100" w:type="dxa"/>
+            </w:tcMar>
+            <w:shd w:fill="202A35"/>
+          </w:tcPr>
+          <w:p>
+            <w:pPr>
+              <w:spacing w:after="0"/>
+            </w:pPr>
+            <w:r>
+              <w:rPr>
+                <w:rFonts w:ascii="Microsoft YaHei" w:hAnsi="Microsoft YaHei" w:eastAsia="Microsoft YaHei"/>
+                <w:b/>
+                <w:color w:val="FFFFFF"/>
+                <w:sz w:val="16"/>
+              </w:rPr>
+              <w:t>DREAMER</w:t>
+            </w:r>
+          </w:p>
+        </w:tc>
+        <w:tc>
+          <w:tcPr>
+            <w:tcW w:type="dxa" w:w="2353"/>
+            <w:vAlign w:val="center"/>
+            <w:tcMar>
+              <w:top w:w="90" w:type="dxa"/>
+              <w:start w:w="100" w:type="dxa"/>
+              <w:bottom w:w="90" w:type="dxa"/>
+              <w:end w:w="100" w:type="dxa"/>
+            </w:tcMar>
+            <w:shd w:fill="202A35"/>
+          </w:tcPr>
+          <w:p>
+            <w:pPr>
+              <w:spacing w:after="0"/>
+            </w:pPr>
+            <w:r>
+              <w:rPr>
+                <w:rFonts w:ascii="Microsoft YaHei" w:hAnsi="Microsoft YaHei" w:eastAsia="Microsoft YaHei"/>
+                <w:b/>
+                <w:color w:val="FFFFFF"/>
+                <w:sz w:val="16"/>
+              </w:rPr>
+              <w:t>CASE</w:t>
+            </w:r>
+          </w:p>
+        </w:tc>
+        <w:tc>
+          <w:tcPr>
+            <w:tcW w:type="dxa" w:w="2353"/>
+            <w:vAlign w:val="center"/>
+            <w:tcMar>
+              <w:top w:w="90" w:type="dxa"/>
+              <w:start w:w="100" w:type="dxa"/>
+              <w:bottom w:w="90" w:type="dxa"/>
+              <w:end w:w="100" w:type="dxa"/>
+            </w:tcMar>
+            <w:shd w:fill="202A35"/>
+          </w:tcPr>
+          <w:p>
+            <w:pPr>
+              <w:spacing w:after="0"/>
+            </w:pPr>
+            <w:r>
+              <w:rPr>
+                <w:rFonts w:ascii="Microsoft YaHei" w:hAnsi="Microsoft YaHei" w:eastAsia="Microsoft YaHei"/>
+                <w:b/>
+                <w:color w:val="FFFFFF"/>
+                <w:sz w:val="16"/>
+              </w:rPr>
+              <w:t>NRC-VAD</w:t>
+            </w:r>
+          </w:p>
+        </w:tc>
+      </w:tr>
+      <w:tr>
+        <w:tc>
+          <w:tcPr>
+            <w:tcW w:type="dxa" w:w="2353"/>
+            <w:vAlign w:val="center"/>
+            <w:tcMar>
+              <w:top w:w="90" w:type="dxa"/>
+              <w:start w:w="100" w:type="dxa"/>
+              <w:bottom w:w="90" w:type="dxa"/>
+              <w:end w:w="100" w:type="dxa"/>
+            </w:tcMar>
+            <w:shd w:fill="FFFFFF"/>
+          </w:tcPr>
+          <w:p>
+            <w:pPr>
+              <w:spacing w:after="0"/>
+            </w:pPr>
+            <w:r>
+              <w:rPr>
+                <w:rFonts w:ascii="Microsoft YaHei" w:hAnsi="Microsoft YaHei" w:eastAsia="Microsoft YaHei"/>
+                <w:b w:val="0"/>
+                <w:color w:val="202A35"/>
+                <w:sz w:val="16"/>
+              </w:rPr>
+              <w:t>类型</w:t>
+            </w:r>
+          </w:p>
+        </w:tc>
+        <w:tc>
+          <w:tcPr>
+            <w:tcW w:type="dxa" w:w="2353"/>
+            <w:vAlign w:val="center"/>
+            <w:tcMar>
+              <w:top w:w="90" w:type="dxa"/>
+              <w:start w:w="100" w:type="dxa"/>
+              <w:bottom w:w="90" w:type="dxa"/>
+              <w:end w:w="100" w:type="dxa"/>
+            </w:tcMar>
+            <w:shd w:fill="FFFFFF"/>
+          </w:tcPr>
+          <w:p>
+            <w:pPr>
+              <w:spacing w:after="0"/>
+            </w:pPr>
+            <w:r>
+              <w:rPr>
+                <w:rFonts w:ascii="Microsoft YaHei" w:hAnsi="Microsoft YaHei" w:eastAsia="Microsoft YaHei"/>
+                <w:b w:val="0"/>
+                <w:color w:val="202A35"/>
+                <w:sz w:val="16"/>
+              </w:rPr>
+              <w:t>影片诱发体验数据库</w:t>
+            </w:r>
+          </w:p>
+        </w:tc>
+        <w:tc>
+          <w:tcPr>
+            <w:tcW w:type="dxa" w:w="2353"/>
+            <w:vAlign w:val="center"/>
+            <w:tcMar>
+              <w:top w:w="90" w:type="dxa"/>
+              <w:start w:w="100" w:type="dxa"/>
+              <w:bottom w:w="90" w:type="dxa"/>
+              <w:end w:w="100" w:type="dxa"/>
+            </w:tcMar>
+            <w:shd w:fill="FFFFFF"/>
+          </w:tcPr>
+          <w:p>
+            <w:pPr>
+              <w:spacing w:after="0"/>
+            </w:pPr>
+            <w:r>
+              <w:rPr>
+                <w:rFonts w:ascii="Microsoft YaHei" w:hAnsi="Microsoft YaHei" w:eastAsia="Microsoft YaHei"/>
+                <w:b w:val="0"/>
+                <w:color w:val="202A35"/>
+                <w:sz w:val="16"/>
+              </w:rPr>
+              <w:t>影片诱发体验数据库</w:t>
+            </w:r>
+          </w:p>
+        </w:tc>
+        <w:tc>
+          <w:tcPr>
+            <w:tcW w:type="dxa" w:w="2353"/>
+            <w:vAlign w:val="center"/>
+            <w:tcMar>
+              <w:top w:w="90" w:type="dxa"/>
+              <w:start w:w="100" w:type="dxa"/>
+              <w:bottom w:w="90" w:type="dxa"/>
+              <w:end w:w="100" w:type="dxa"/>
+            </w:tcMar>
+            <w:shd w:fill="FFFFFF"/>
+          </w:tcPr>
+          <w:p>
+            <w:pPr>
+              <w:spacing w:after="0"/>
+            </w:pPr>
+            <w:r>
+              <w:rPr>
+                <w:rFonts w:ascii="Microsoft YaHei" w:hAnsi="Microsoft YaHei" w:eastAsia="Microsoft YaHei"/>
+                <w:b w:val="0"/>
+                <w:color w:val="202A35"/>
+                <w:sz w:val="16"/>
+              </w:rPr>
+              <w:t>大规模词汇情感常模</w:t>
+            </w:r>
+          </w:p>
+        </w:tc>
+      </w:tr>
+      <w:tr>
+        <w:tc>
+          <w:tcPr>
+            <w:tcW w:type="dxa" w:w="2353"/>
+            <w:vAlign w:val="center"/>
+            <w:tcMar>
+              <w:top w:w="90" w:type="dxa"/>
+              <w:start w:w="100" w:type="dxa"/>
+              <w:bottom w:w="90" w:type="dxa"/>
+              <w:end w:w="100" w:type="dxa"/>
+            </w:tcMar>
+            <w:shd w:fill="F2F5F7"/>
+          </w:tcPr>
+          <w:p>
+            <w:pPr>
+              <w:spacing w:after="0"/>
+            </w:pPr>
+            <w:r>
+              <w:rPr>
+                <w:rFonts w:ascii="Microsoft YaHei" w:hAnsi="Microsoft YaHei" w:eastAsia="Microsoft YaHei"/>
+                <w:b w:val="0"/>
+                <w:color w:val="202A35"/>
+                <w:sz w:val="16"/>
+              </w:rPr>
+              <w:t>参与者</w:t>
+            </w:r>
+          </w:p>
+        </w:tc>
+        <w:tc>
+          <w:tcPr>
+            <w:tcW w:type="dxa" w:w="2353"/>
+            <w:vAlign w:val="center"/>
+            <w:tcMar>
+              <w:top w:w="90" w:type="dxa"/>
+              <w:start w:w="100" w:type="dxa"/>
+              <w:bottom w:w="90" w:type="dxa"/>
+              <w:end w:w="100" w:type="dxa"/>
+            </w:tcMar>
+            <w:shd w:fill="F2F5F7"/>
+          </w:tcPr>
+          <w:p>
+            <w:pPr>
+              <w:spacing w:after="0"/>
+            </w:pPr>
+            <w:r>
+              <w:rPr>
+                <w:rFonts w:ascii="Microsoft YaHei" w:hAnsi="Microsoft YaHei" w:eastAsia="Microsoft YaHei"/>
+                <w:b w:val="0"/>
+                <w:color w:val="202A35"/>
+                <w:sz w:val="16"/>
+              </w:rPr>
+              <w:t>23人</w:t>
+            </w:r>
+          </w:p>
+        </w:tc>
+        <w:tc>
+          <w:tcPr>
+            <w:tcW w:type="dxa" w:w="2353"/>
+            <w:vAlign w:val="center"/>
+            <w:tcMar>
+              <w:top w:w="90" w:type="dxa"/>
+              <w:start w:w="100" w:type="dxa"/>
+              <w:bottom w:w="90" w:type="dxa"/>
+              <w:end w:w="100" w:type="dxa"/>
+            </w:tcMar>
+            <w:shd w:fill="F2F5F7"/>
+          </w:tcPr>
+          <w:p>
+            <w:pPr>
+              <w:spacing w:after="0"/>
+            </w:pPr>
+            <w:r>
+              <w:rPr>
+                <w:rFonts w:ascii="Microsoft YaHei" w:hAnsi="Microsoft YaHei" w:eastAsia="Microsoft YaHei"/>
+                <w:b w:val="0"/>
+                <w:color w:val="202A35"/>
+                <w:sz w:val="16"/>
+              </w:rPr>
+              <w:t>30人</w:t>
+            </w:r>
+          </w:p>
+        </w:tc>
+        <w:tc>
+          <w:tcPr>
+            <w:tcW w:type="dxa" w:w="2353"/>
+            <w:vAlign w:val="center"/>
+            <w:tcMar>
+              <w:top w:w="90" w:type="dxa"/>
+              <w:start w:w="100" w:type="dxa"/>
+              <w:bottom w:w="90" w:type="dxa"/>
+              <w:end w:w="100" w:type="dxa"/>
+            </w:tcMar>
+            <w:shd w:fill="F2F5F7"/>
+          </w:tcPr>
+          <w:p>
+            <w:pPr>
+              <w:spacing w:after="0"/>
+            </w:pPr>
+            <w:r>
+              <w:rPr>
+                <w:rFonts w:ascii="Microsoft YaHei" w:hAnsi="Microsoft YaHei" w:eastAsia="Microsoft YaHei"/>
+                <w:b w:val="0"/>
+                <w:color w:val="202A35"/>
+                <w:sz w:val="16"/>
+              </w:rPr>
+              <w:t>众包评分者（每词≥10人）</w:t>
+            </w:r>
+          </w:p>
+        </w:tc>
+      </w:tr>
+      <w:tr>
+        <w:tc>
+          <w:tcPr>
+            <w:tcW w:type="dxa" w:w="2353"/>
+            <w:vAlign w:val="center"/>
+            <w:tcMar>
+              <w:top w:w="90" w:type="dxa"/>
+              <w:start w:w="100" w:type="dxa"/>
+              <w:bottom w:w="90" w:type="dxa"/>
+              <w:end w:w="100" w:type="dxa"/>
+            </w:tcMar>
+            <w:shd w:fill="FFFFFF"/>
+          </w:tcPr>
+          <w:p>
+            <w:pPr>
+              <w:spacing w:after="0"/>
+            </w:pPr>
+            <w:r>
+              <w:rPr>
+                <w:rFonts w:ascii="Microsoft YaHei" w:hAnsi="Microsoft YaHei" w:eastAsia="Microsoft YaHei"/>
+                <w:b w:val="0"/>
+                <w:color w:val="202A35"/>
+                <w:sz w:val="16"/>
+              </w:rPr>
+              <w:t>刺激</w:t>
+            </w:r>
+          </w:p>
+        </w:tc>
+        <w:tc>
+          <w:tcPr>
+            <w:tcW w:type="dxa" w:w="2353"/>
+            <w:vAlign w:val="center"/>
+            <w:tcMar>
+              <w:top w:w="90" w:type="dxa"/>
+              <w:start w:w="100" w:type="dxa"/>
+              <w:bottom w:w="90" w:type="dxa"/>
+              <w:end w:w="100" w:type="dxa"/>
+            </w:tcMar>
+            <w:shd w:fill="FFFFFF"/>
+          </w:tcPr>
+          <w:p>
+            <w:pPr>
+              <w:spacing w:after="0"/>
+            </w:pPr>
+            <w:r>
+              <w:rPr>
+                <w:rFonts w:ascii="Microsoft YaHei" w:hAnsi="Microsoft YaHei" w:eastAsia="Microsoft YaHei"/>
+                <w:b w:val="0"/>
+                <w:color w:val="202A35"/>
+                <w:sz w:val="16"/>
+              </w:rPr>
+              <w:t>18段影音（9类×2段）</w:t>
+            </w:r>
+          </w:p>
+        </w:tc>
+        <w:tc>
+          <w:tcPr>
+            <w:tcW w:type="dxa" w:w="2353"/>
+            <w:vAlign w:val="center"/>
+            <w:tcMar>
+              <w:top w:w="90" w:type="dxa"/>
+              <w:start w:w="100" w:type="dxa"/>
+              <w:bottom w:w="90" w:type="dxa"/>
+              <w:end w:w="100" w:type="dxa"/>
+            </w:tcMar>
+            <w:shd w:fill="FFFFFF"/>
+          </w:tcPr>
+          <w:p>
+            <w:pPr>
+              <w:spacing w:after="0"/>
+            </w:pPr>
+            <w:r>
+              <w:rPr>
+                <w:rFonts w:ascii="Microsoft YaHei" w:hAnsi="Microsoft YaHei" w:eastAsia="Microsoft YaHei"/>
+                <w:b w:val="0"/>
+                <w:color w:val="202A35"/>
+                <w:sz w:val="16"/>
+              </w:rPr>
+              <w:t>8段情绪视频（4类）</w:t>
+            </w:r>
+          </w:p>
+        </w:tc>
+        <w:tc>
+          <w:tcPr>
+            <w:tcW w:type="dxa" w:w="2353"/>
+            <w:vAlign w:val="center"/>
+            <w:tcMar>
+              <w:top w:w="90" w:type="dxa"/>
+              <w:start w:w="100" w:type="dxa"/>
+              <w:bottom w:w="90" w:type="dxa"/>
+              <w:end w:w="100" w:type="dxa"/>
+            </w:tcMar>
+            <w:shd w:fill="FFFFFF"/>
+          </w:tcPr>
+          <w:p>
+            <w:pPr>
+              <w:spacing w:after="0"/>
+            </w:pPr>
+            <w:r>
+              <w:rPr>
+                <w:rFonts w:ascii="Microsoft YaHei" w:hAnsi="Microsoft YaHei" w:eastAsia="Microsoft YaHei"/>
+                <w:b w:val="0"/>
+                <w:color w:val="202A35"/>
+                <w:sz w:val="16"/>
+              </w:rPr>
+              <w:t>20,000+英文词条</w:t>
+            </w:r>
+          </w:p>
+        </w:tc>
+      </w:tr>
+      <w:tr>
+        <w:tc>
+          <w:tcPr>
+            <w:tcW w:type="dxa" w:w="2353"/>
+            <w:vAlign w:val="center"/>
+            <w:tcMar>
+              <w:top w:w="90" w:type="dxa"/>
+              <w:start w:w="100" w:type="dxa"/>
+              <w:bottom w:w="90" w:type="dxa"/>
+              <w:end w:w="100" w:type="dxa"/>
+            </w:tcMar>
+            <w:shd w:fill="F2F5F7"/>
+          </w:tcPr>
+          <w:p>
+            <w:pPr>
+              <w:spacing w:after="0"/>
+            </w:pPr>
+            <w:r>
+              <w:rPr>
+                <w:rFonts w:ascii="Microsoft YaHei" w:hAnsi="Microsoft YaHei" w:eastAsia="Microsoft YaHei"/>
+                <w:b w:val="0"/>
+                <w:color w:val="202A35"/>
+                <w:sz w:val="16"/>
+              </w:rPr>
+              <w:t>情绪类别</w:t>
+            </w:r>
+          </w:p>
+        </w:tc>
+        <w:tc>
+          <w:tcPr>
+            <w:tcW w:type="dxa" w:w="2353"/>
+            <w:vAlign w:val="center"/>
+            <w:tcMar>
+              <w:top w:w="90" w:type="dxa"/>
+              <w:start w:w="100" w:type="dxa"/>
+              <w:bottom w:w="90" w:type="dxa"/>
+              <w:end w:w="100" w:type="dxa"/>
+            </w:tcMar>
+            <w:shd w:fill="F2F5F7"/>
+          </w:tcPr>
+          <w:p>
+            <w:pPr>
+              <w:spacing w:after="0"/>
+            </w:pPr>
+            <w:r>
+              <w:rPr>
+                <w:rFonts w:ascii="Microsoft YaHei" w:hAnsi="Microsoft YaHei" w:eastAsia="Microsoft YaHei"/>
+                <w:b w:val="0"/>
+                <w:color w:val="202A35"/>
+                <w:sz w:val="16"/>
+              </w:rPr>
+              <w:t>9类（可命名离散情绪）</w:t>
+            </w:r>
+          </w:p>
+        </w:tc>
+        <w:tc>
+          <w:tcPr>
+            <w:tcW w:type="dxa" w:w="2353"/>
+            <w:vAlign w:val="center"/>
+            <w:tcMar>
+              <w:top w:w="90" w:type="dxa"/>
+              <w:start w:w="100" w:type="dxa"/>
+              <w:bottom w:w="90" w:type="dxa"/>
+              <w:end w:w="100" w:type="dxa"/>
+            </w:tcMar>
+            <w:shd w:fill="F2F5F7"/>
+          </w:tcPr>
+          <w:p>
+            <w:pPr>
+              <w:spacing w:after="0"/>
+            </w:pPr>
+            <w:r>
+              <w:rPr>
+                <w:rFonts w:ascii="Microsoft YaHei" w:hAnsi="Microsoft YaHei" w:eastAsia="Microsoft YaHei"/>
+                <w:b w:val="0"/>
+                <w:color w:val="202A35"/>
+                <w:sz w:val="16"/>
+              </w:rPr>
+              <w:t>4类可命名</w:t>
+            </w:r>
+          </w:p>
+        </w:tc>
+        <w:tc>
+          <w:tcPr>
+            <w:tcW w:type="dxa" w:w="2353"/>
+            <w:vAlign w:val="center"/>
+            <w:tcMar>
+              <w:top w:w="90" w:type="dxa"/>
+              <w:start w:w="100" w:type="dxa"/>
+              <w:bottom w:w="90" w:type="dxa"/>
+              <w:end w:w="100" w:type="dxa"/>
+            </w:tcMar>
+            <w:shd w:fill="F2F5F7"/>
+          </w:tcPr>
+          <w:p>
+            <w:pPr>
+              <w:spacing w:after="0"/>
+            </w:pPr>
+            <w:r>
+              <w:rPr>
+                <w:rFonts w:ascii="Microsoft YaHei" w:hAnsi="Microsoft YaHei" w:eastAsia="Microsoft YaHei"/>
+                <w:b w:val="0"/>
+                <w:color w:val="202A35"/>
+                <w:sz w:val="16"/>
+              </w:rPr>
+              <w:t>任意选取</w:t>
+            </w:r>
+          </w:p>
+        </w:tc>
+      </w:tr>
+      <w:tr>
+        <w:tc>
+          <w:tcPr>
+            <w:tcW w:type="dxa" w:w="2353"/>
+            <w:vAlign w:val="center"/>
+            <w:tcMar>
+              <w:top w:w="90" w:type="dxa"/>
+              <w:start w:w="100" w:type="dxa"/>
+              <w:bottom w:w="90" w:type="dxa"/>
+              <w:end w:w="100" w:type="dxa"/>
+            </w:tcMar>
+            <w:shd w:fill="FFFFFF"/>
+          </w:tcPr>
+          <w:p>
+            <w:pPr>
+              <w:spacing w:after="0"/>
+            </w:pPr>
+            <w:r>
+              <w:rPr>
+                <w:rFonts w:ascii="Microsoft YaHei" w:hAnsi="Microsoft YaHei" w:eastAsia="Microsoft YaHei"/>
+                <w:b w:val="0"/>
+                <w:color w:val="202A35"/>
+                <w:sz w:val="16"/>
+              </w:rPr>
+              <w:t>VAD维度</w:t>
+            </w:r>
+          </w:p>
+        </w:tc>
+        <w:tc>
+          <w:tcPr>
+            <w:tcW w:type="dxa" w:w="2353"/>
+            <w:vAlign w:val="center"/>
+            <w:tcMar>
+              <w:top w:w="90" w:type="dxa"/>
+              <w:start w:w="100" w:type="dxa"/>
+              <w:bottom w:w="90" w:type="dxa"/>
+              <w:end w:w="100" w:type="dxa"/>
+            </w:tcMar>
+            <w:shd w:fill="FFFFFF"/>
+          </w:tcPr>
+          <w:p>
+            <w:pPr>
+              <w:spacing w:after="0"/>
+            </w:pPr>
+            <w:r>
+              <w:rPr>
+                <w:rFonts w:ascii="Microsoft YaHei" w:hAnsi="Microsoft YaHei" w:eastAsia="Microsoft YaHei"/>
+                <w:b w:val="0"/>
+                <w:color w:val="202A35"/>
+                <w:sz w:val="16"/>
+              </w:rPr>
+              <w:t>V+A+D, 1-5 SAM</w:t>
+            </w:r>
+          </w:p>
+        </w:tc>
+        <w:tc>
+          <w:tcPr>
+            <w:tcW w:type="dxa" w:w="2353"/>
+            <w:vAlign w:val="center"/>
+            <w:tcMar>
+              <w:top w:w="90" w:type="dxa"/>
+              <w:start w:w="100" w:type="dxa"/>
+              <w:bottom w:w="90" w:type="dxa"/>
+              <w:end w:w="100" w:type="dxa"/>
+            </w:tcMar>
+            <w:shd w:fill="FFFFFF"/>
+          </w:tcPr>
+          <w:p>
+            <w:pPr>
+              <w:spacing w:after="0"/>
+            </w:pPr>
+            <w:r>
+              <w:rPr>
+                <w:rFonts w:ascii="Microsoft YaHei" w:hAnsi="Microsoft YaHei" w:eastAsia="Microsoft YaHei"/>
+                <w:b w:val="0"/>
+                <w:color w:val="202A35"/>
+                <w:sz w:val="16"/>
+              </w:rPr>
+              <w:t>V+A连续（0.5-9.5），</w:t>
+            </w:r>
+            <w:r>
+              <w:rPr>
+                <w:rFonts w:ascii="Microsoft YaHei" w:hAnsi="Microsoft YaHei" w:eastAsia="Microsoft YaHei"/>
+                <w:b w:val="0"/>
+                <w:color w:val="202A35"/>
+                <w:sz w:val="16"/>
+              </w:rPr>
+              <w:t>无D</w:t>
+            </w:r>
+          </w:p>
+        </w:tc>
+        <w:tc>
+          <w:tcPr>
+            <w:tcW w:type="dxa" w:w="2353"/>
+            <w:vAlign w:val="center"/>
+            <w:tcMar>
+              <w:top w:w="90" w:type="dxa"/>
+              <w:start w:w="100" w:type="dxa"/>
+              <w:bottom w:w="90" w:type="dxa"/>
+              <w:end w:w="100" w:type="dxa"/>
+            </w:tcMar>
+            <w:shd w:fill="FFFFFF"/>
+          </w:tcPr>
+          <w:p>
+            <w:pPr>
+              <w:spacing w:after="0"/>
+            </w:pPr>
+            <w:r>
+              <w:rPr>
+                <w:rFonts w:ascii="Microsoft YaHei" w:hAnsi="Microsoft YaHei" w:eastAsia="Microsoft YaHei"/>
+                <w:b w:val="0"/>
+                <w:color w:val="202A35"/>
+                <w:sz w:val="16"/>
+              </w:rPr>
+              <w:t>V+A+D, 0-1连续</w:t>
+            </w:r>
+          </w:p>
+        </w:tc>
+      </w:tr>
+      <w:tr>
+        <w:tc>
+          <w:tcPr>
+            <w:tcW w:type="dxa" w:w="2353"/>
+            <w:vAlign w:val="center"/>
+            <w:tcMar>
+              <w:top w:w="90" w:type="dxa"/>
+              <w:start w:w="100" w:type="dxa"/>
+              <w:bottom w:w="90" w:type="dxa"/>
+              <w:end w:w="100" w:type="dxa"/>
+            </w:tcMar>
+            <w:shd w:fill="F2F5F7"/>
+          </w:tcPr>
+          <w:p>
+            <w:pPr>
+              <w:spacing w:after="0"/>
+            </w:pPr>
+            <w:r>
+              <w:rPr>
+                <w:rFonts w:ascii="Microsoft YaHei" w:hAnsi="Microsoft YaHei" w:eastAsia="Microsoft YaHei"/>
+                <w:b w:val="0"/>
+                <w:color w:val="202A35"/>
+                <w:sz w:val="16"/>
+              </w:rPr>
+              <w:t>任务</w:t>
+            </w:r>
+          </w:p>
+        </w:tc>
+        <w:tc>
+          <w:tcPr>
+            <w:tcW w:type="dxa" w:w="2353"/>
+            <w:vAlign w:val="center"/>
+            <w:tcMar>
+              <w:top w:w="90" w:type="dxa"/>
+              <w:start w:w="100" w:type="dxa"/>
+              <w:bottom w:w="90" w:type="dxa"/>
+              <w:end w:w="100" w:type="dxa"/>
+            </w:tcMar>
+            <w:shd w:fill="F2F5F7"/>
+          </w:tcPr>
+          <w:p>
+            <w:pPr>
+              <w:spacing w:after="0"/>
+            </w:pPr>
+            <w:r>
+              <w:rPr>
+                <w:rFonts w:ascii="Microsoft YaHei" w:hAnsi="Microsoft YaHei" w:eastAsia="Microsoft YaHei"/>
+                <w:b w:val="0"/>
+                <w:color w:val="202A35"/>
+                <w:sz w:val="16"/>
+              </w:rPr>
+              <w:t>观看影片后即时SAM自评</w:t>
+            </w:r>
+          </w:p>
+        </w:tc>
+        <w:tc>
+          <w:tcPr>
+            <w:tcW w:type="dxa" w:w="2353"/>
+            <w:vAlign w:val="center"/>
+            <w:tcMar>
+              <w:top w:w="90" w:type="dxa"/>
+              <w:start w:w="100" w:type="dxa"/>
+              <w:bottom w:w="90" w:type="dxa"/>
+              <w:end w:w="100" w:type="dxa"/>
+            </w:tcMar>
+            <w:shd w:fill="F2F5F7"/>
+          </w:tcPr>
+          <w:p>
+            <w:pPr>
+              <w:spacing w:after="0"/>
+            </w:pPr>
+            <w:r>
+              <w:rPr>
+                <w:rFonts w:ascii="Microsoft YaHei" w:hAnsi="Microsoft YaHei" w:eastAsia="Microsoft YaHei"/>
+                <w:b w:val="0"/>
+                <w:color w:val="202A35"/>
+                <w:sz w:val="16"/>
+              </w:rPr>
+              <w:t>观看影片后连续VA自评</w:t>
+            </w:r>
+          </w:p>
+        </w:tc>
+        <w:tc>
+          <w:tcPr>
+            <w:tcW w:type="dxa" w:w="2353"/>
+            <w:vAlign w:val="center"/>
+            <w:tcMar>
+              <w:top w:w="90" w:type="dxa"/>
+              <w:start w:w="100" w:type="dxa"/>
+              <w:bottom w:w="90" w:type="dxa"/>
+              <w:end w:w="100" w:type="dxa"/>
+            </w:tcMar>
+            <w:shd w:fill="F2F5F7"/>
+          </w:tcPr>
+          <w:p>
+            <w:pPr>
+              <w:spacing w:after="0"/>
+            </w:pPr>
+            <w:r>
+              <w:rPr>
+                <w:rFonts w:ascii="Microsoft YaHei" w:hAnsi="Microsoft YaHei" w:eastAsia="Microsoft YaHei"/>
+                <w:b w:val="0"/>
+                <w:color w:val="202A35"/>
+                <w:sz w:val="16"/>
+              </w:rPr>
+              <w:t>判断词语本身的情感属性</w:t>
+            </w:r>
+          </w:p>
+        </w:tc>
+      </w:tr>
+      <w:tr>
+        <w:tc>
+          <w:tcPr>
+            <w:tcW w:type="dxa" w:w="2353"/>
+            <w:vAlign w:val="center"/>
+            <w:tcMar>
+              <w:top w:w="90" w:type="dxa"/>
+              <w:start w:w="100" w:type="dxa"/>
+              <w:bottom w:w="90" w:type="dxa"/>
+              <w:end w:w="100" w:type="dxa"/>
+            </w:tcMar>
+            <w:shd w:fill="FFFFFF"/>
+          </w:tcPr>
+          <w:p>
+            <w:pPr>
+              <w:spacing w:after="0"/>
+            </w:pPr>
+            <w:r>
+              <w:rPr>
+                <w:rFonts w:ascii="Microsoft YaHei" w:hAnsi="Microsoft YaHei" w:eastAsia="Microsoft YaHei"/>
+                <w:b w:val="0"/>
+                <w:color w:val="202A35"/>
+                <w:sz w:val="16"/>
+              </w:rPr>
+              <w:t>生理信号</w:t>
+            </w:r>
+          </w:p>
+        </w:tc>
+        <w:tc>
+          <w:tcPr>
+            <w:tcW w:type="dxa" w:w="2353"/>
+            <w:vAlign w:val="center"/>
+            <w:tcMar>
+              <w:top w:w="90" w:type="dxa"/>
+              <w:start w:w="100" w:type="dxa"/>
+              <w:bottom w:w="90" w:type="dxa"/>
+              <w:end w:w="100" w:type="dxa"/>
+            </w:tcMar>
+            <w:shd w:fill="FFFFFF"/>
+          </w:tcPr>
+          <w:p>
+            <w:pPr>
+              <w:spacing w:after="0"/>
+            </w:pPr>
+            <w:r>
+              <w:rPr>
+                <w:rFonts w:ascii="Microsoft YaHei" w:hAnsi="Microsoft YaHei" w:eastAsia="Microsoft YaHei"/>
+                <w:b w:val="0"/>
+                <w:color w:val="202A35"/>
+                <w:sz w:val="16"/>
+              </w:rPr>
+              <w:t>14ch EEG + 2ch ECG</w:t>
+            </w:r>
+          </w:p>
+        </w:tc>
+        <w:tc>
+          <w:tcPr>
+            <w:tcW w:type="dxa" w:w="2353"/>
+            <w:vAlign w:val="center"/>
+            <w:tcMar>
+              <w:top w:w="90" w:type="dxa"/>
+              <w:start w:w="100" w:type="dxa"/>
+              <w:bottom w:w="90" w:type="dxa"/>
+              <w:end w:w="100" w:type="dxa"/>
+            </w:tcMar>
+            <w:shd w:fill="FFFFFF"/>
+          </w:tcPr>
+          <w:p>
+            <w:pPr>
+              <w:spacing w:after="0"/>
+            </w:pPr>
+            <w:r>
+              <w:rPr>
+                <w:rFonts w:ascii="Microsoft YaHei" w:hAnsi="Microsoft YaHei" w:eastAsia="Microsoft YaHei"/>
+                <w:b w:val="0"/>
+                <w:color w:val="202A35"/>
+                <w:sz w:val="16"/>
+              </w:rPr>
+              <w:t>GSR, BVP, 皮温, 呼吸, 面部EMG</w:t>
+            </w:r>
+          </w:p>
+        </w:tc>
+        <w:tc>
+          <w:tcPr>
+            <w:tcW w:type="dxa" w:w="2353"/>
+            <w:vAlign w:val="center"/>
+            <w:tcMar>
+              <w:top w:w="90" w:type="dxa"/>
+              <w:start w:w="100" w:type="dxa"/>
+              <w:bottom w:w="90" w:type="dxa"/>
+              <w:end w:w="100" w:type="dxa"/>
+            </w:tcMar>
+            <w:shd w:fill="FFFFFF"/>
+          </w:tcPr>
+          <w:p>
+            <w:pPr>
+              <w:spacing w:after="0"/>
+            </w:pPr>
+            <w:r>
+              <w:rPr>
+                <w:rFonts w:ascii="Microsoft YaHei" w:hAnsi="Microsoft YaHei" w:eastAsia="Microsoft YaHei"/>
+                <w:b w:val="0"/>
+                <w:color w:val="202A35"/>
+                <w:sz w:val="16"/>
+              </w:rPr>
+              <w:t>无</w:t>
+            </w:r>
+          </w:p>
+        </w:tc>
+      </w:tr>
+      <w:tr>
+        <w:tc>
+          <w:tcPr>
+            <w:tcW w:type="dxa" w:w="2353"/>
+            <w:vAlign w:val="center"/>
+            <w:tcMar>
+              <w:top w:w="90" w:type="dxa"/>
+              <w:start w:w="100" w:type="dxa"/>
+              <w:bottom w:w="90" w:type="dxa"/>
+              <w:end w:w="100" w:type="dxa"/>
+            </w:tcMar>
+            <w:shd w:fill="F2F5F7"/>
+          </w:tcPr>
+          <w:p>
+            <w:pPr>
+              <w:spacing w:after="0"/>
+            </w:pPr>
+            <w:r>
+              <w:rPr>
+                <w:rFonts w:ascii="Microsoft YaHei" w:hAnsi="Microsoft YaHei" w:eastAsia="Microsoft YaHei"/>
+                <w:b w:val="0"/>
+                <w:color w:val="202A35"/>
+                <w:sz w:val="16"/>
+              </w:rPr>
+              <w:t>本研究角色</w:t>
+            </w:r>
+          </w:p>
+        </w:tc>
+        <w:tc>
+          <w:tcPr>
+            <w:tcW w:type="dxa" w:w="2353"/>
+            <w:vAlign w:val="center"/>
+            <w:tcMar>
+              <w:top w:w="90" w:type="dxa"/>
+              <w:start w:w="100" w:type="dxa"/>
+              <w:bottom w:w="90" w:type="dxa"/>
+              <w:end w:w="100" w:type="dxa"/>
+            </w:tcMar>
+            <w:shd w:fill="F2F5F7"/>
+          </w:tcPr>
+          <w:p>
+            <w:pPr>
+              <w:spacing w:after="0"/>
+            </w:pPr>
+            <w:r>
+              <w:rPr>
+                <w:rFonts w:ascii="Microsoft YaHei" w:hAnsi="Microsoft YaHei" w:eastAsia="Microsoft YaHei"/>
+                <w:b w:val="0"/>
+                <w:color w:val="202A35"/>
+                <w:sz w:val="16"/>
+              </w:rPr>
+              <w:t>主数据</w:t>
+            </w:r>
+            <w:r>
+              <w:rPr>
+                <w:rFonts w:ascii="Microsoft YaHei" w:hAnsi="Microsoft YaHei" w:eastAsia="Microsoft YaHei"/>
+                <w:b w:val="0"/>
+                <w:color w:val="202A35"/>
+                <w:sz w:val="16"/>
+              </w:rPr>
+              <w:t>：三维全维度对齐</w:t>
+            </w:r>
+          </w:p>
+        </w:tc>
+        <w:tc>
+          <w:tcPr>
+            <w:tcW w:type="dxa" w:w="2353"/>
+            <w:vAlign w:val="center"/>
+            <w:tcMar>
+              <w:top w:w="90" w:type="dxa"/>
+              <w:start w:w="100" w:type="dxa"/>
+              <w:bottom w:w="90" w:type="dxa"/>
+              <w:end w:w="100" w:type="dxa"/>
+            </w:tcMar>
+            <w:shd w:fill="F2F5F7"/>
+          </w:tcPr>
+          <w:p>
+            <w:pPr>
+              <w:spacing w:after="0"/>
+            </w:pPr>
+            <w:r>
+              <w:rPr>
+                <w:rFonts w:ascii="Microsoft YaHei" w:hAnsi="Microsoft YaHei" w:eastAsia="Microsoft YaHei"/>
+                <w:b w:val="0"/>
+                <w:color w:val="202A35"/>
+                <w:sz w:val="16"/>
+              </w:rPr>
+              <w:t>方法试跑</w:t>
+            </w:r>
+            <w:r>
+              <w:rPr>
+                <w:rFonts w:ascii="Microsoft YaHei" w:hAnsi="Microsoft YaHei" w:eastAsia="Microsoft YaHei"/>
+                <w:b w:val="0"/>
+                <w:color w:val="202A35"/>
+                <w:sz w:val="16"/>
+              </w:rPr>
+              <w:t>：VA流程验证+恢复曲线支线</w:t>
+            </w:r>
+          </w:p>
+        </w:tc>
+        <w:tc>
+          <w:tcPr>
+            <w:tcW w:type="dxa" w:w="2353"/>
+            <w:vAlign w:val="center"/>
+            <w:tcMar>
+              <w:top w:w="90" w:type="dxa"/>
+              <w:start w:w="100" w:type="dxa"/>
+              <w:bottom w:w="90" w:type="dxa"/>
+              <w:end w:w="100" w:type="dxa"/>
+            </w:tcMar>
+            <w:shd w:fill="F2F5F7"/>
+          </w:tcPr>
+          <w:p>
+            <w:pPr>
+              <w:spacing w:after="0"/>
+            </w:pPr>
+            <w:r>
+              <w:rPr>
+                <w:rFonts w:ascii="Microsoft YaHei" w:hAnsi="Microsoft YaHei" w:eastAsia="Microsoft YaHei"/>
+                <w:b w:val="0"/>
+                <w:color w:val="202A35"/>
+                <w:sz w:val="16"/>
+              </w:rPr>
+              <w:t>参照基准</w:t>
+            </w:r>
+            <w:r>
+              <w:rPr>
+                <w:rFonts w:ascii="Microsoft YaHei" w:hAnsi="Microsoft YaHei" w:eastAsia="Microsoft YaHei"/>
+                <w:b w:val="0"/>
+                <w:color w:val="202A35"/>
+                <w:sz w:val="16"/>
+              </w:rPr>
+              <w:t>：跨任务比较标准</w:t>
+            </w:r>
+          </w:p>
+        </w:tc>
+      </w:tr>
+      <w:tr>
+        <w:tc>
+          <w:tcPr>
+            <w:tcW w:type="dxa" w:w="2353"/>
+            <w:vAlign w:val="center"/>
+            <w:tcMar>
+              <w:top w:w="90" w:type="dxa"/>
+              <w:start w:w="100" w:type="dxa"/>
+              <w:bottom w:w="90" w:type="dxa"/>
+              <w:end w:w="100" w:type="dxa"/>
+            </w:tcMar>
+            <w:shd w:fill="FFFFFF"/>
+          </w:tcPr>
+          <w:p>
+            <w:pPr>
+              <w:spacing w:after="0"/>
+            </w:pPr>
+            <w:r>
+              <w:rPr>
+                <w:rFonts w:ascii="Microsoft YaHei" w:hAnsi="Microsoft YaHei" w:eastAsia="Microsoft YaHei"/>
+                <w:b w:val="0"/>
+                <w:color w:val="202A35"/>
+                <w:sz w:val="16"/>
+              </w:rPr>
+              <w:t>核心局限</w:t>
+            </w:r>
+          </w:p>
+        </w:tc>
+        <w:tc>
+          <w:tcPr>
+            <w:tcW w:type="dxa" w:w="2353"/>
+            <w:vAlign w:val="center"/>
+            <w:tcMar>
+              <w:top w:w="90" w:type="dxa"/>
+              <w:start w:w="100" w:type="dxa"/>
+              <w:bottom w:w="90" w:type="dxa"/>
+              <w:end w:w="100" w:type="dxa"/>
+            </w:tcMar>
+            <w:shd w:fill="FFFFFF"/>
+          </w:tcPr>
+          <w:p>
+            <w:pPr>
+              <w:spacing w:after="0"/>
+            </w:pPr>
+            <w:r>
+              <w:rPr>
+                <w:rFonts w:ascii="Microsoft YaHei" w:hAnsi="Microsoft YaHei" w:eastAsia="Microsoft YaHei"/>
+                <w:b w:val="0"/>
+                <w:color w:val="202A35"/>
+                <w:sz w:val="16"/>
+              </w:rPr>
+              <w:t>每类仅2段影片，N=23</w:t>
+            </w:r>
+          </w:p>
+        </w:tc>
+        <w:tc>
+          <w:tcPr>
+            <w:tcW w:type="dxa" w:w="2353"/>
+            <w:vAlign w:val="center"/>
+            <w:tcMar>
+              <w:top w:w="90" w:type="dxa"/>
+              <w:start w:w="100" w:type="dxa"/>
+              <w:bottom w:w="90" w:type="dxa"/>
+              <w:end w:w="100" w:type="dxa"/>
+            </w:tcMar>
+            <w:shd w:fill="FFFFFF"/>
+          </w:tcPr>
+          <w:p>
+            <w:pPr>
+              <w:spacing w:after="0"/>
+            </w:pPr>
+            <w:r>
+              <w:rPr>
+                <w:rFonts w:ascii="Microsoft YaHei" w:hAnsi="Microsoft YaHei" w:eastAsia="Microsoft YaHei"/>
+                <w:b w:val="0"/>
+                <w:color w:val="202A35"/>
+                <w:sz w:val="16"/>
+              </w:rPr>
+              <w:t>仅4类、无Dominance</w:t>
+            </w:r>
+          </w:p>
+        </w:tc>
+        <w:tc>
+          <w:tcPr>
+            <w:tcW w:type="dxa" w:w="2353"/>
+            <w:vAlign w:val="center"/>
+            <w:tcMar>
+              <w:top w:w="90" w:type="dxa"/>
+              <w:start w:w="100" w:type="dxa"/>
+              <w:bottom w:w="90" w:type="dxa"/>
+              <w:end w:w="100" w:type="dxa"/>
+            </w:tcMar>
+            <w:shd w:fill="FFFFFF"/>
+          </w:tcPr>
+          <w:p>
+            <w:pPr>
+              <w:spacing w:after="0"/>
+            </w:pPr>
+            <w:r>
+              <w:rPr>
+                <w:rFonts w:ascii="Microsoft YaHei" w:hAnsi="Microsoft YaHei" w:eastAsia="Microsoft YaHei"/>
+                <w:b w:val="0"/>
+                <w:color w:val="202A35"/>
+                <w:sz w:val="16"/>
+              </w:rPr>
+              <w:t>不含体验信息，不确定性未传播</w:t>
+            </w:r>
+          </w:p>
+        </w:tc>
+      </w:tr>
+    </w:tbl>
+    <w:p>
+      <w:pPr>
+        <w:spacing w:after="20"/>
+      </w:pPr>
+    </w:p>
+    <w:p>
+      <w:pPr>
+        <w:ind w:firstLine="420"/>
+      </w:pPr>
+      <w:r>
+        <w:rPr>
+          <w:rFonts w:ascii="Microsoft YaHei" w:hAnsi="Microsoft YaHei" w:eastAsia="Microsoft YaHei"/>
+          <w:b/>
+        </w:rPr>
+        <w:t>三个数据库的一致性</w:t>
+      </w:r>
+      <w:r>
+        <w:rPr>
+          <w:rFonts w:ascii="Microsoft YaHei" w:hAnsi="Microsoft YaHei" w:eastAsia="Microsoft YaHei"/>
+        </w:rPr>
+        <w:t>：Valence方向在三个数据库中一致——CASE和DREAMER的诱发VA均与NRC词义坐标呈现方向一致的正负效价对应。CASE的二维VA试跑在四类情绪上复现了DREAMER主分析的分析流程和量尺转换方法。</w:t>
+      </w:r>
+    </w:p>
+    <w:p>
+      <w:pPr>
+        <w:ind w:firstLine="420"/>
+      </w:pPr>
+      <w:r>
+        <w:rPr>
+          <w:rFonts w:ascii="Microsoft YaHei" w:hAnsi="Microsoft YaHei" w:eastAsia="Microsoft YaHei"/>
+          <w:b/>
+        </w:rPr>
+        <w:t>三个数据库的关键差异</w:t>
+      </w:r>
+      <w:r>
+        <w:rPr>
+          <w:rFonts w:ascii="Microsoft YaHei" w:hAnsi="Microsoft YaHei" w:eastAsia="Microsoft YaHei"/>
+        </w:rPr>
+        <w:t>：Dominance是最大的分水岭——CASE无D自评，DREAMER有D但未发现跨情境对应（r=-.121），NRC-VAD有D但反映的是词汇层面的力量/控制联想。三个数据库中Dominance的测量可迁移性均为未解决问题。此外，类别覆盖（CASE仅4类 vs DREAMER 9类）和任务类型（离线词汇判断 vs 即时体验报告）构成另外两个系统性差异。</w:t>
+      </w:r>
+    </w:p>
+    <w:p>
+      <w:pPr>
         <w:pStyle w:val="Heading1"/>
       </w:pPr>
       <w:r>
@@ -742,7 +1963,7 @@
         <w:rPr>
           <w:rFonts w:ascii="Microsoft YaHei" w:hAnsi="Microsoft YaHei" w:eastAsia="Microsoft YaHei"/>
         </w:rPr>
-        <w:t>提取末 60 秒相对基线的 EEG 相对频带功率、额叶 alpha 不对称、ECG 心率、RMSSD 和 SDNN。</w:t>
+        <w:t>提取末 60 秒相对基线的 EEG 相对频带功率、额叶 alpha 不对称（FAA）、ECG 心率、RMSSD 和 SDNN。</w:t>
       </w:r>
     </w:p>
     <w:p>
@@ -2704,7 +3925,7 @@
         <w:rPr>
           <w:rFonts w:ascii="Microsoft YaHei" w:hAnsi="Microsoft YaHei" w:eastAsia="Microsoft YaHei"/>
         </w:rPr>
-        <w:t xml:space="preserve">试次级模型使用全部 414 个试次，控制影片固定效应并按参与者聚类标准误。EEG theta/alpha/beta 相对功率、额叶 alpha 不对称，以及 ECG 心率、RMSSD、SDNN 对 VAD 对齐距离的效应在 Holm 校正后均为 </w:t>
+        <w:t xml:space="preserve">试次级模型使用全部 414 个试次，控制影片固定效应并按参与者聚类标准误。EEG theta/alpha/beta 相对功率、额叶 alpha 不对称（FAA），以及 ECG 心率、RMSSD、SDNN 对 VAD 对齐距离的效应在 Holm 校正后均为 </w:t>
       </w:r>
       <w:r>
         <w:rPr>
@@ -2718,7 +3939,7 @@
         <w:rPr>
           <w:rFonts w:ascii="Microsoft YaHei" w:hAnsi="Microsoft YaHei" w:eastAsia="Microsoft YaHei"/>
         </w:rPr>
-        <w:t>。</w:t>
+        <w:t>。在补充分析中，基于额叶 alpha 不对称与趋近/回避动机系统的理论关联（Davidson, 1992; Harmon-Jones &amp; Gable, 2018），我们额外检验了FAA→Dominance偏差的特异性关联，结果同样未达到显著水平。</w:t>
       </w:r>
     </w:p>
     <w:p>
@@ -2742,7 +3963,7 @@
         <w:rPr>
           <w:rFonts w:ascii="Microsoft YaHei" w:hAnsi="Microsoft YaHei" w:eastAsia="Microsoft YaHei"/>
         </w:rPr>
-        <w:t>。它不代表生理信号与情绪差异无关。可能原因包括样本量有限、每类仅两段影片、末 60 秒平均掩盖动态变化、跨影片噪声较大，以及 VAD 距离本身混合了多个心理过程。</w:t>
+        <w:t>。它不代表生理信号与情绪差异无关，也不排除FAA与Dominance之间存在更细粒度的关系。可能原因包括：样本量有限（N=23）、每类仅两段影片、14通道低密度EEG对额叶不对称的空间分辨率不足、末60秒平均掩盖动态变化、以及DREAMER的Dominance评分本身与NRC常模缺乏结构对应——如果Dominance评分在测量层面已存在构念混淆，生理关联的检验将缺乏有效的表型变量。</w:t>
       </w:r>
     </w:p>
     <w:p>
@@ -2889,54 +4110,6 @@
           <w:sz w:val="18"/>
         </w:rPr>
         <w:t>visualization/dreamer-vad-3d/index.html</w:t>
-      </w:r>
-    </w:p>
-    <w:p>
-      <w:pPr>
-        <w:keepLines/>
-        <w:jc w:val="center"/>
-      </w:pPr>
-      <w:r>
-        <w:drawing>
-          <wp:inline xmlns:a="http://schemas.openxmlformats.org/drawingml/2006/main" xmlns:pic="http://schemas.openxmlformats.org/drawingml/2006/picture">
-            <wp:extent cx="5577840" cy="3486150"/>
-            <wp:docPr id="2" name="Picture 2"/>
-            <wp:cNvGraphicFramePr>
-              <a:graphicFrameLocks noChangeAspect="1"/>
-            </wp:cNvGraphicFramePr>
-            <a:graphic>
-              <a:graphicData uri="http://schemas.openxmlformats.org/drawingml/2006/picture">
-                <pic:pic>
-                  <pic:nvPicPr>
-                    <pic:cNvPr id="0" name="desktop.png"/>
-                    <pic:cNvPicPr/>
-                  </pic:nvPicPr>
-                  <pic:blipFill>
-                    <a:blip r:embed="rId12"/>
-                    <a:stretch>
-                      <a:fillRect/>
-                    </a:stretch>
-                  </pic:blipFill>
-                  <pic:spPr>
-                    <a:xfrm>
-                      <a:off x="0" y="0"/>
-                      <a:ext cx="5577840" cy="3486150"/>
-                    </a:xfrm>
-                    <a:prstGeom prst="rect"/>
-                  </pic:spPr>
-                </pic:pic>
-              </a:graphicData>
-            </a:graphic>
-          </wp:inline>
-        </w:drawing>
-      </w:r>
-    </w:p>
-    <w:p>
-      <w:pPr>
-        <w:pStyle w:val="CaptionCN"/>
-      </w:pPr>
-      <w:r>
-        <w:t>图2  Web 3D 模型：两套 VAD 坐标及情绪差异向量</w:t>
       </w:r>
     </w:p>
     <w:p>
@@ -3362,7 +4535,7 @@
         <w:rPr>
           <w:rFonts w:ascii="Microsoft YaHei" w:hAnsi="Microsoft YaHei" w:eastAsia="Microsoft YaHei"/>
         </w:rPr>
-        <w:t>9. 下一阶段工作安排</w:t>
+        <w:t>9. 工作状态：已完成与未开始的明确边界</w:t>
       </w:r>
     </w:p>
     <w:p>
@@ -3373,68 +4546,1053 @@
         <w:rPr>
           <w:rFonts w:ascii="Microsoft YaHei" w:hAnsi="Microsoft YaHei" w:eastAsia="Microsoft YaHei"/>
         </w:rPr>
-        <w:t>第一优先级：完成可投稿的主分析</w:t>
+        <w:t>9.1 已完成 ✓</w:t>
       </w:r>
     </w:p>
+    <w:tbl>
+      <w:tblPr>
+        <w:tblStyle w:val="TableGrid"/>
+        <w:tblW w:type="auto" w:w="0"/>
+        <w:jc w:val="center"/>
+        <w:tblLayout w:type="autofit"/>
+        <w:tblLook w:firstColumn="1" w:firstRow="1" w:lastColumn="0" w:lastRow="0" w:noHBand="0" w:noVBand="1" w:val="04A0"/>
+      </w:tblPr>
+      <w:tblGrid>
+        <w:gridCol w:w="3137"/>
+        <w:gridCol w:w="3137"/>
+        <w:gridCol w:w="3137"/>
+      </w:tblGrid>
+      <w:tr>
+        <w:trPr>
+          <w:tblHeader w:val="true"/>
+        </w:trPr>
+        <w:tc>
+          <w:tcPr>
+            <w:tcW w:type="dxa" w:w="3137"/>
+            <w:vAlign w:val="center"/>
+            <w:tcMar>
+              <w:top w:w="90" w:type="dxa"/>
+              <w:start w:w="100" w:type="dxa"/>
+              <w:bottom w:w="90" w:type="dxa"/>
+              <w:end w:w="100" w:type="dxa"/>
+            </w:tcMar>
+            <w:shd w:fill="202A35"/>
+          </w:tcPr>
+          <w:p>
+            <w:pPr>
+              <w:spacing w:after="0"/>
+            </w:pPr>
+            <w:r>
+              <w:rPr>
+                <w:rFonts w:ascii="Microsoft YaHei" w:hAnsi="Microsoft YaHei" w:eastAsia="Microsoft YaHei"/>
+                <w:b/>
+                <w:color w:val="FFFFFF"/>
+                <w:sz w:val="16"/>
+              </w:rPr>
+              <w:t>工作项</w:t>
+            </w:r>
+          </w:p>
+        </w:tc>
+        <w:tc>
+          <w:tcPr>
+            <w:tcW w:type="dxa" w:w="3137"/>
+            <w:vAlign w:val="center"/>
+            <w:tcMar>
+              <w:top w:w="90" w:type="dxa"/>
+              <w:start w:w="100" w:type="dxa"/>
+              <w:bottom w:w="90" w:type="dxa"/>
+              <w:end w:w="100" w:type="dxa"/>
+            </w:tcMar>
+            <w:shd w:fill="202A35"/>
+          </w:tcPr>
+          <w:p>
+            <w:pPr>
+              <w:spacing w:after="0"/>
+            </w:pPr>
+            <w:r>
+              <w:rPr>
+                <w:rFonts w:ascii="Microsoft YaHei" w:hAnsi="Microsoft YaHei" w:eastAsia="Microsoft YaHei"/>
+                <w:b/>
+                <w:color w:val="FFFFFF"/>
+                <w:sz w:val="16"/>
+              </w:rPr>
+              <w:t>状态</w:t>
+            </w:r>
+          </w:p>
+        </w:tc>
+        <w:tc>
+          <w:tcPr>
+            <w:tcW w:type="dxa" w:w="3137"/>
+            <w:vAlign w:val="center"/>
+            <w:tcMar>
+              <w:top w:w="90" w:type="dxa"/>
+              <w:start w:w="100" w:type="dxa"/>
+              <w:bottom w:w="90" w:type="dxa"/>
+              <w:end w:w="100" w:type="dxa"/>
+            </w:tcMar>
+            <w:shd w:fill="202A35"/>
+          </w:tcPr>
+          <w:p>
+            <w:pPr>
+              <w:spacing w:after="0"/>
+            </w:pPr>
+            <w:r>
+              <w:rPr>
+                <w:rFonts w:ascii="Microsoft YaHei" w:hAnsi="Microsoft YaHei" w:eastAsia="Microsoft YaHei"/>
+                <w:b/>
+                <w:color w:val="FFFFFF"/>
+                <w:sz w:val="16"/>
+              </w:rPr>
+              <w:t>产出位置</w:t>
+            </w:r>
+          </w:p>
+        </w:tc>
+      </w:tr>
+      <w:tr>
+        <w:tc>
+          <w:tcPr>
+            <w:tcW w:type="dxa" w:w="3137"/>
+            <w:vAlign w:val="center"/>
+            <w:tcMar>
+              <w:top w:w="90" w:type="dxa"/>
+              <w:start w:w="100" w:type="dxa"/>
+              <w:bottom w:w="90" w:type="dxa"/>
+              <w:end w:w="100" w:type="dxa"/>
+            </w:tcMar>
+            <w:shd w:fill="FFFFFF"/>
+          </w:tcPr>
+          <w:p>
+            <w:pPr>
+              <w:spacing w:after="0"/>
+            </w:pPr>
+            <w:r>
+              <w:rPr>
+                <w:rFonts w:ascii="Microsoft YaHei" w:hAnsi="Microsoft YaHei" w:eastAsia="Microsoft YaHei"/>
+                <w:b w:val="0"/>
+                <w:color w:val="202A35"/>
+                <w:sz w:val="16"/>
+              </w:rPr>
+              <w:t>DREAMER主分析（类别相关、距离、LOEO校准）</w:t>
+            </w:r>
+          </w:p>
+        </w:tc>
+        <w:tc>
+          <w:tcPr>
+            <w:tcW w:type="dxa" w:w="3137"/>
+            <w:vAlign w:val="center"/>
+            <w:tcMar>
+              <w:top w:w="90" w:type="dxa"/>
+              <w:start w:w="100" w:type="dxa"/>
+              <w:bottom w:w="90" w:type="dxa"/>
+              <w:end w:w="100" w:type="dxa"/>
+            </w:tcMar>
+            <w:shd w:fill="FFFFFF"/>
+          </w:tcPr>
+          <w:p>
+            <w:pPr>
+              <w:spacing w:after="0"/>
+            </w:pPr>
+            <w:r>
+              <w:rPr>
+                <w:rFonts w:ascii="Microsoft YaHei" w:hAnsi="Microsoft YaHei" w:eastAsia="Microsoft YaHei"/>
+                <w:b w:val="0"/>
+                <w:color w:val="202A35"/>
+                <w:sz w:val="16"/>
+              </w:rPr>
+              <w:t>✅ 完成</w:t>
+            </w:r>
+          </w:p>
+        </w:tc>
+        <w:tc>
+          <w:tcPr>
+            <w:tcW w:type="dxa" w:w="3137"/>
+            <w:vAlign w:val="center"/>
+            <w:tcMar>
+              <w:top w:w="90" w:type="dxa"/>
+              <w:start w:w="100" w:type="dxa"/>
+              <w:bottom w:w="90" w:type="dxa"/>
+              <w:end w:w="100" w:type="dxa"/>
+            </w:tcMar>
+            <w:shd w:fill="FFFFFF"/>
+          </w:tcPr>
+          <w:p>
+            <w:pPr>
+              <w:spacing w:after="0"/>
+            </w:pPr>
+            <w:r>
+              <w:rPr>
+                <w:rFonts w:ascii="Microsoft YaHei" w:hAnsi="Microsoft YaHei" w:eastAsia="Microsoft YaHei"/>
+                <w:b w:val="0"/>
+                <w:color w:val="202A35"/>
+                <w:sz w:val="16"/>
+              </w:rPr>
+              <w:t>analysis/dreamer_nrc_pilot.py</w:t>
+            </w:r>
+          </w:p>
+        </w:tc>
+      </w:tr>
+      <w:tr>
+        <w:tc>
+          <w:tcPr>
+            <w:tcW w:type="dxa" w:w="3137"/>
+            <w:vAlign w:val="center"/>
+            <w:tcMar>
+              <w:top w:w="90" w:type="dxa"/>
+              <w:start w:w="100" w:type="dxa"/>
+              <w:bottom w:w="90" w:type="dxa"/>
+              <w:end w:w="100" w:type="dxa"/>
+            </w:tcMar>
+            <w:shd w:fill="F2F5F7"/>
+          </w:tcPr>
+          <w:p>
+            <w:pPr>
+              <w:spacing w:after="0"/>
+            </w:pPr>
+            <w:r>
+              <w:rPr>
+                <w:rFonts w:ascii="Microsoft YaHei" w:hAnsi="Microsoft YaHei" w:eastAsia="Microsoft YaHei"/>
+                <w:b w:val="0"/>
+                <w:color w:val="202A35"/>
+                <w:sz w:val="16"/>
+              </w:rPr>
+              <w:t>全部9! = 362,880精确类别置换 + Holm校正</w:t>
+            </w:r>
+          </w:p>
+        </w:tc>
+        <w:tc>
+          <w:tcPr>
+            <w:tcW w:type="dxa" w:w="3137"/>
+            <w:vAlign w:val="center"/>
+            <w:tcMar>
+              <w:top w:w="90" w:type="dxa"/>
+              <w:start w:w="100" w:type="dxa"/>
+              <w:bottom w:w="90" w:type="dxa"/>
+              <w:end w:w="100" w:type="dxa"/>
+            </w:tcMar>
+            <w:shd w:fill="F2F5F7"/>
+          </w:tcPr>
+          <w:p>
+            <w:pPr>
+              <w:spacing w:after="0"/>
+            </w:pPr>
+            <w:r>
+              <w:rPr>
+                <w:rFonts w:ascii="Microsoft YaHei" w:hAnsi="Microsoft YaHei" w:eastAsia="Microsoft YaHei"/>
+                <w:b w:val="0"/>
+                <w:color w:val="202A35"/>
+                <w:sz w:val="16"/>
+              </w:rPr>
+              <w:t>✅ 完成</w:t>
+            </w:r>
+          </w:p>
+        </w:tc>
+        <w:tc>
+          <w:tcPr>
+            <w:tcW w:type="dxa" w:w="3137"/>
+            <w:vAlign w:val="center"/>
+            <w:tcMar>
+              <w:top w:w="90" w:type="dxa"/>
+              <w:start w:w="100" w:type="dxa"/>
+              <w:bottom w:w="90" w:type="dxa"/>
+              <w:end w:w="100" w:type="dxa"/>
+            </w:tcMar>
+            <w:shd w:fill="F2F5F7"/>
+          </w:tcPr>
+          <w:p>
+            <w:pPr>
+              <w:spacing w:after="0"/>
+            </w:pPr>
+            <w:r>
+              <w:rPr>
+                <w:rFonts w:ascii="Microsoft YaHei" w:hAnsi="Microsoft YaHei" w:eastAsia="Microsoft YaHei"/>
+                <w:b w:val="0"/>
+                <w:color w:val="202A35"/>
+                <w:sz w:val="16"/>
+              </w:rPr>
+              <w:t>results/dreamer_nrc_robustness/</w:t>
+            </w:r>
+          </w:p>
+        </w:tc>
+      </w:tr>
+      <w:tr>
+        <w:tc>
+          <w:tcPr>
+            <w:tcW w:type="dxa" w:w="3137"/>
+            <w:vAlign w:val="center"/>
+            <w:tcMar>
+              <w:top w:w="90" w:type="dxa"/>
+              <w:start w:w="100" w:type="dxa"/>
+              <w:bottom w:w="90" w:type="dxa"/>
+              <w:end w:w="100" w:type="dxa"/>
+            </w:tcMar>
+            <w:shd w:fill="FFFFFF"/>
+          </w:tcPr>
+          <w:p>
+            <w:pPr>
+              <w:spacing w:after="0"/>
+            </w:pPr>
+            <w:r>
+              <w:rPr>
+                <w:rFonts w:ascii="Microsoft YaHei" w:hAnsi="Microsoft YaHei" w:eastAsia="Microsoft YaHei"/>
+                <w:b w:val="0"/>
+                <w:color w:val="202A35"/>
+                <w:sz w:val="16"/>
+              </w:rPr>
+              <w:t>5,000次参与者+影片双层bootstrap</w:t>
+            </w:r>
+          </w:p>
+        </w:tc>
+        <w:tc>
+          <w:tcPr>
+            <w:tcW w:type="dxa" w:w="3137"/>
+            <w:vAlign w:val="center"/>
+            <w:tcMar>
+              <w:top w:w="90" w:type="dxa"/>
+              <w:start w:w="100" w:type="dxa"/>
+              <w:bottom w:w="90" w:type="dxa"/>
+              <w:end w:w="100" w:type="dxa"/>
+            </w:tcMar>
+            <w:shd w:fill="FFFFFF"/>
+          </w:tcPr>
+          <w:p>
+            <w:pPr>
+              <w:spacing w:after="0"/>
+            </w:pPr>
+            <w:r>
+              <w:rPr>
+                <w:rFonts w:ascii="Microsoft YaHei" w:hAnsi="Microsoft YaHei" w:eastAsia="Microsoft YaHei"/>
+                <w:b w:val="0"/>
+                <w:color w:val="202A35"/>
+                <w:sz w:val="16"/>
+              </w:rPr>
+              <w:t>✅ 完成</w:t>
+            </w:r>
+          </w:p>
+        </w:tc>
+        <w:tc>
+          <w:tcPr>
+            <w:tcW w:type="dxa" w:w="3137"/>
+            <w:vAlign w:val="center"/>
+            <w:tcMar>
+              <w:top w:w="90" w:type="dxa"/>
+              <w:start w:w="100" w:type="dxa"/>
+              <w:bottom w:w="90" w:type="dxa"/>
+              <w:end w:w="100" w:type="dxa"/>
+            </w:tcMar>
+            <w:shd w:fill="FFFFFF"/>
+          </w:tcPr>
+          <w:p>
+            <w:pPr>
+              <w:spacing w:after="0"/>
+            </w:pPr>
+            <w:r>
+              <w:rPr>
+                <w:rFonts w:ascii="Microsoft YaHei" w:hAnsi="Microsoft YaHei" w:eastAsia="Microsoft YaHei"/>
+                <w:b w:val="0"/>
+                <w:color w:val="202A35"/>
+                <w:sz w:val="16"/>
+              </w:rPr>
+              <w:t>同上</w:t>
+            </w:r>
+          </w:p>
+        </w:tc>
+      </w:tr>
+      <w:tr>
+        <w:tc>
+          <w:tcPr>
+            <w:tcW w:type="dxa" w:w="3137"/>
+            <w:vAlign w:val="center"/>
+            <w:tcMar>
+              <w:top w:w="90" w:type="dxa"/>
+              <w:start w:w="100" w:type="dxa"/>
+              <w:bottom w:w="90" w:type="dxa"/>
+              <w:end w:w="100" w:type="dxa"/>
+            </w:tcMar>
+            <w:shd w:fill="F2F5F7"/>
+          </w:tcPr>
+          <w:p>
+            <w:pPr>
+              <w:spacing w:after="0"/>
+            </w:pPr>
+            <w:r>
+              <w:rPr>
+                <w:rFonts w:ascii="Microsoft YaHei" w:hAnsi="Microsoft YaHei" w:eastAsia="Microsoft YaHei"/>
+                <w:b w:val="0"/>
+                <w:color w:val="202A35"/>
+                <w:sz w:val="16"/>
+              </w:rPr>
+              <w:t>逐类删除敏感性分析</w:t>
+            </w:r>
+          </w:p>
+        </w:tc>
+        <w:tc>
+          <w:tcPr>
+            <w:tcW w:type="dxa" w:w="3137"/>
+            <w:vAlign w:val="center"/>
+            <w:tcMar>
+              <w:top w:w="90" w:type="dxa"/>
+              <w:start w:w="100" w:type="dxa"/>
+              <w:bottom w:w="90" w:type="dxa"/>
+              <w:end w:w="100" w:type="dxa"/>
+            </w:tcMar>
+            <w:shd w:fill="F2F5F7"/>
+          </w:tcPr>
+          <w:p>
+            <w:pPr>
+              <w:spacing w:after="0"/>
+            </w:pPr>
+            <w:r>
+              <w:rPr>
+                <w:rFonts w:ascii="Microsoft YaHei" w:hAnsi="Microsoft YaHei" w:eastAsia="Microsoft YaHei"/>
+                <w:b w:val="0"/>
+                <w:color w:val="202A35"/>
+                <w:sz w:val="16"/>
+              </w:rPr>
+              <w:t>✅ 完成</w:t>
+            </w:r>
+          </w:p>
+        </w:tc>
+        <w:tc>
+          <w:tcPr>
+            <w:tcW w:type="dxa" w:w="3137"/>
+            <w:vAlign w:val="center"/>
+            <w:tcMar>
+              <w:top w:w="90" w:type="dxa"/>
+              <w:start w:w="100" w:type="dxa"/>
+              <w:bottom w:w="90" w:type="dxa"/>
+              <w:end w:w="100" w:type="dxa"/>
+            </w:tcMar>
+            <w:shd w:fill="F2F5F7"/>
+          </w:tcPr>
+          <w:p>
+            <w:pPr>
+              <w:spacing w:after="0"/>
+            </w:pPr>
+            <w:r>
+              <w:rPr>
+                <w:rFonts w:ascii="Microsoft YaHei" w:hAnsi="Microsoft YaHei" w:eastAsia="Microsoft YaHei"/>
+                <w:b w:val="0"/>
+                <w:color w:val="202A35"/>
+                <w:sz w:val="16"/>
+              </w:rPr>
+              <w:t>同上</w:t>
+            </w:r>
+          </w:p>
+        </w:tc>
+      </w:tr>
+      <w:tr>
+        <w:tc>
+          <w:tcPr>
+            <w:tcW w:type="dxa" w:w="3137"/>
+            <w:vAlign w:val="center"/>
+            <w:tcMar>
+              <w:top w:w="90" w:type="dxa"/>
+              <w:start w:w="100" w:type="dxa"/>
+              <w:bottom w:w="90" w:type="dxa"/>
+              <w:end w:w="100" w:type="dxa"/>
+            </w:tcMar>
+            <w:shd w:fill="FFFFFF"/>
+          </w:tcPr>
+          <w:p>
+            <w:pPr>
+              <w:spacing w:after="0"/>
+            </w:pPr>
+            <w:r>
+              <w:rPr>
+                <w:rFonts w:ascii="Microsoft YaHei" w:hAnsi="Microsoft YaHei" w:eastAsia="Microsoft YaHei"/>
+                <w:b w:val="0"/>
+                <w:color w:val="202A35"/>
+                <w:sz w:val="16"/>
+              </w:rPr>
+              <w:t>名词/形容词 + Dominance方向敏感性分析</w:t>
+            </w:r>
+          </w:p>
+        </w:tc>
+        <w:tc>
+          <w:tcPr>
+            <w:tcW w:type="dxa" w:w="3137"/>
+            <w:vAlign w:val="center"/>
+            <w:tcMar>
+              <w:top w:w="90" w:type="dxa"/>
+              <w:start w:w="100" w:type="dxa"/>
+              <w:bottom w:w="90" w:type="dxa"/>
+              <w:end w:w="100" w:type="dxa"/>
+            </w:tcMar>
+            <w:shd w:fill="FFFFFF"/>
+          </w:tcPr>
+          <w:p>
+            <w:pPr>
+              <w:spacing w:after="0"/>
+            </w:pPr>
+            <w:r>
+              <w:rPr>
+                <w:rFonts w:ascii="Microsoft YaHei" w:hAnsi="Microsoft YaHei" w:eastAsia="Microsoft YaHei"/>
+                <w:b w:val="0"/>
+                <w:color w:val="202A35"/>
+                <w:sz w:val="16"/>
+              </w:rPr>
+              <w:t>✅ 完成</w:t>
+            </w:r>
+          </w:p>
+        </w:tc>
+        <w:tc>
+          <w:tcPr>
+            <w:tcW w:type="dxa" w:w="3137"/>
+            <w:vAlign w:val="center"/>
+            <w:tcMar>
+              <w:top w:w="90" w:type="dxa"/>
+              <w:start w:w="100" w:type="dxa"/>
+              <w:bottom w:w="90" w:type="dxa"/>
+              <w:end w:w="100" w:type="dxa"/>
+            </w:tcMar>
+            <w:shd w:fill="FFFFFF"/>
+          </w:tcPr>
+          <w:p>
+            <w:pPr>
+              <w:spacing w:after="0"/>
+            </w:pPr>
+            <w:r>
+              <w:rPr>
+                <w:rFonts w:ascii="Microsoft YaHei" w:hAnsi="Microsoft YaHei" w:eastAsia="Microsoft YaHei"/>
+                <w:b w:val="0"/>
+                <w:color w:val="202A35"/>
+                <w:sz w:val="16"/>
+              </w:rPr>
+              <w:t>同上</w:t>
+            </w:r>
+          </w:p>
+        </w:tc>
+      </w:tr>
+      <w:tr>
+        <w:tc>
+          <w:tcPr>
+            <w:tcW w:type="dxa" w:w="3137"/>
+            <w:vAlign w:val="center"/>
+            <w:tcMar>
+              <w:top w:w="90" w:type="dxa"/>
+              <w:start w:w="100" w:type="dxa"/>
+              <w:bottom w:w="90" w:type="dxa"/>
+              <w:end w:w="100" w:type="dxa"/>
+            </w:tcMar>
+            <w:shd w:fill="F2F5F7"/>
+          </w:tcPr>
+          <w:p>
+            <w:pPr>
+              <w:spacing w:after="0"/>
+            </w:pPr>
+            <w:r>
+              <w:rPr>
+                <w:rFonts w:ascii="Microsoft YaHei" w:hAnsi="Microsoft YaHei" w:eastAsia="Microsoft YaHei"/>
+                <w:b w:val="0"/>
+                <w:color w:val="202A35"/>
+                <w:sz w:val="16"/>
+              </w:rPr>
+              <w:t>整体三维构型一致性检验</w:t>
+            </w:r>
+          </w:p>
+        </w:tc>
+        <w:tc>
+          <w:tcPr>
+            <w:tcW w:type="dxa" w:w="3137"/>
+            <w:vAlign w:val="center"/>
+            <w:tcMar>
+              <w:top w:w="90" w:type="dxa"/>
+              <w:start w:w="100" w:type="dxa"/>
+              <w:bottom w:w="90" w:type="dxa"/>
+              <w:end w:w="100" w:type="dxa"/>
+            </w:tcMar>
+            <w:shd w:fill="F2F5F7"/>
+          </w:tcPr>
+          <w:p>
+            <w:pPr>
+              <w:spacing w:after="0"/>
+            </w:pPr>
+            <w:r>
+              <w:rPr>
+                <w:rFonts w:ascii="Microsoft YaHei" w:hAnsi="Microsoft YaHei" w:eastAsia="Microsoft YaHei"/>
+                <w:b w:val="0"/>
+                <w:color w:val="202A35"/>
+                <w:sz w:val="16"/>
+              </w:rPr>
+              <w:t>✅ 完成</w:t>
+            </w:r>
+          </w:p>
+        </w:tc>
+        <w:tc>
+          <w:tcPr>
+            <w:tcW w:type="dxa" w:w="3137"/>
+            <w:vAlign w:val="center"/>
+            <w:tcMar>
+              <w:top w:w="90" w:type="dxa"/>
+              <w:start w:w="100" w:type="dxa"/>
+              <w:bottom w:w="90" w:type="dxa"/>
+              <w:end w:w="100" w:type="dxa"/>
+            </w:tcMar>
+            <w:shd w:fill="F2F5F7"/>
+          </w:tcPr>
+          <w:p>
+            <w:pPr>
+              <w:spacing w:after="0"/>
+            </w:pPr>
+            <w:r>
+              <w:rPr>
+                <w:rFonts w:ascii="Microsoft YaHei" w:hAnsi="Microsoft YaHei" w:eastAsia="Microsoft YaHei"/>
+                <w:b w:val="0"/>
+                <w:color w:val="202A35"/>
+                <w:sz w:val="16"/>
+              </w:rPr>
+              <w:t>同上</w:t>
+            </w:r>
+          </w:p>
+        </w:tc>
+      </w:tr>
+      <w:tr>
+        <w:tc>
+          <w:tcPr>
+            <w:tcW w:type="dxa" w:w="3137"/>
+            <w:vAlign w:val="center"/>
+            <w:tcMar>
+              <w:top w:w="90" w:type="dxa"/>
+              <w:start w:w="100" w:type="dxa"/>
+              <w:bottom w:w="90" w:type="dxa"/>
+              <w:end w:w="100" w:type="dxa"/>
+            </w:tcMar>
+            <w:shd w:fill="FFFFFF"/>
+          </w:tcPr>
+          <w:p>
+            <w:pPr>
+              <w:spacing w:after="0"/>
+            </w:pPr>
+            <w:r>
+              <w:rPr>
+                <w:rFonts w:ascii="Microsoft YaHei" w:hAnsi="Microsoft YaHei" w:eastAsia="Microsoft YaHei"/>
+                <w:b w:val="0"/>
+                <w:color w:val="202A35"/>
+                <w:sz w:val="16"/>
+              </w:rPr>
+              <w:t>CASE VA试跑 + 词形敏感性</w:t>
+            </w:r>
+          </w:p>
+        </w:tc>
+        <w:tc>
+          <w:tcPr>
+            <w:tcW w:type="dxa" w:w="3137"/>
+            <w:vAlign w:val="center"/>
+            <w:tcMar>
+              <w:top w:w="90" w:type="dxa"/>
+              <w:start w:w="100" w:type="dxa"/>
+              <w:bottom w:w="90" w:type="dxa"/>
+              <w:end w:w="100" w:type="dxa"/>
+            </w:tcMar>
+            <w:shd w:fill="FFFFFF"/>
+          </w:tcPr>
+          <w:p>
+            <w:pPr>
+              <w:spacing w:after="0"/>
+            </w:pPr>
+            <w:r>
+              <w:rPr>
+                <w:rFonts w:ascii="Microsoft YaHei" w:hAnsi="Microsoft YaHei" w:eastAsia="Microsoft YaHei"/>
+                <w:b w:val="0"/>
+                <w:color w:val="202A35"/>
+                <w:sz w:val="16"/>
+              </w:rPr>
+              <w:t>✅ 完成</w:t>
+            </w:r>
+          </w:p>
+        </w:tc>
+        <w:tc>
+          <w:tcPr>
+            <w:tcW w:type="dxa" w:w="3137"/>
+            <w:vAlign w:val="center"/>
+            <w:tcMar>
+              <w:top w:w="90" w:type="dxa"/>
+              <w:start w:w="100" w:type="dxa"/>
+              <w:bottom w:w="90" w:type="dxa"/>
+              <w:end w:w="100" w:type="dxa"/>
+            </w:tcMar>
+            <w:shd w:fill="FFFFFF"/>
+          </w:tcPr>
+          <w:p>
+            <w:pPr>
+              <w:spacing w:after="0"/>
+            </w:pPr>
+            <w:r>
+              <w:rPr>
+                <w:rFonts w:ascii="Microsoft YaHei" w:hAnsi="Microsoft YaHei" w:eastAsia="Microsoft YaHei"/>
+                <w:b w:val="0"/>
+                <w:color w:val="202A35"/>
+                <w:sz w:val="16"/>
+              </w:rPr>
+              <w:t>public_data/case_pilot/</w:t>
+            </w:r>
+          </w:p>
+        </w:tc>
+      </w:tr>
+      <w:tr>
+        <w:tc>
+          <w:tcPr>
+            <w:tcW w:type="dxa" w:w="3137"/>
+            <w:vAlign w:val="center"/>
+            <w:tcMar>
+              <w:top w:w="90" w:type="dxa"/>
+              <w:start w:w="100" w:type="dxa"/>
+              <w:bottom w:w="90" w:type="dxa"/>
+              <w:end w:w="100" w:type="dxa"/>
+            </w:tcMar>
+            <w:shd w:fill="F2F5F7"/>
+          </w:tcPr>
+          <w:p>
+            <w:pPr>
+              <w:spacing w:after="0"/>
+            </w:pPr>
+            <w:r>
+              <w:rPr>
+                <w:rFonts w:ascii="Microsoft YaHei" w:hAnsi="Microsoft YaHei" w:eastAsia="Microsoft YaHei"/>
+                <w:b w:val="0"/>
+                <w:color w:val="202A35"/>
+                <w:sz w:val="16"/>
+              </w:rPr>
+              <w:t>粗粒度EEG/ECG探索性分析（含FAA→Dominance检验）</w:t>
+            </w:r>
+          </w:p>
+        </w:tc>
+        <w:tc>
+          <w:tcPr>
+            <w:tcW w:type="dxa" w:w="3137"/>
+            <w:vAlign w:val="center"/>
+            <w:tcMar>
+              <w:top w:w="90" w:type="dxa"/>
+              <w:start w:w="100" w:type="dxa"/>
+              <w:bottom w:w="90" w:type="dxa"/>
+              <w:end w:w="100" w:type="dxa"/>
+            </w:tcMar>
+            <w:shd w:fill="F2F5F7"/>
+          </w:tcPr>
+          <w:p>
+            <w:pPr>
+              <w:spacing w:after="0"/>
+            </w:pPr>
+            <w:r>
+              <w:rPr>
+                <w:rFonts w:ascii="Microsoft YaHei" w:hAnsi="Microsoft YaHei" w:eastAsia="Microsoft YaHei"/>
+                <w:b w:val="0"/>
+                <w:color w:val="202A35"/>
+                <w:sz w:val="16"/>
+              </w:rPr>
+              <w:t>✅ 完成</w:t>
+            </w:r>
+          </w:p>
+        </w:tc>
+        <w:tc>
+          <w:tcPr>
+            <w:tcW w:type="dxa" w:w="3137"/>
+            <w:vAlign w:val="center"/>
+            <w:tcMar>
+              <w:top w:w="90" w:type="dxa"/>
+              <w:start w:w="100" w:type="dxa"/>
+              <w:bottom w:w="90" w:type="dxa"/>
+              <w:end w:w="100" w:type="dxa"/>
+            </w:tcMar>
+            <w:shd w:fill="F2F5F7"/>
+          </w:tcPr>
+          <w:p>
+            <w:pPr>
+              <w:spacing w:after="0"/>
+            </w:pPr>
+            <w:r>
+              <w:rPr>
+                <w:rFonts w:ascii="Microsoft YaHei" w:hAnsi="Microsoft YaHei" w:eastAsia="Microsoft YaHei"/>
+                <w:b w:val="0"/>
+                <w:color w:val="202A35"/>
+                <w:sz w:val="16"/>
+              </w:rPr>
+              <w:t>analysis/dreamer_nrc_pilot.py</w:t>
+            </w:r>
+          </w:p>
+        </w:tc>
+      </w:tr>
+      <w:tr>
+        <w:tc>
+          <w:tcPr>
+            <w:tcW w:type="dxa" w:w="3137"/>
+            <w:vAlign w:val="center"/>
+            <w:tcMar>
+              <w:top w:w="90" w:type="dxa"/>
+              <w:start w:w="100" w:type="dxa"/>
+              <w:bottom w:w="90" w:type="dxa"/>
+              <w:end w:w="100" w:type="dxa"/>
+            </w:tcMar>
+            <w:shd w:fill="FFFFFF"/>
+          </w:tcPr>
+          <w:p>
+            <w:pPr>
+              <w:spacing w:after="0"/>
+            </w:pPr>
+            <w:r>
+              <w:rPr>
+                <w:rFonts w:ascii="Microsoft YaHei" w:hAnsi="Microsoft YaHei" w:eastAsia="Microsoft YaHei"/>
+                <w:b w:val="0"/>
+                <w:color w:val="202A35"/>
+                <w:sz w:val="16"/>
+              </w:rPr>
+              <w:t>论文级静态图（4张）+ Web 3D模型</w:t>
+            </w:r>
+          </w:p>
+        </w:tc>
+        <w:tc>
+          <w:tcPr>
+            <w:tcW w:type="dxa" w:w="3137"/>
+            <w:vAlign w:val="center"/>
+            <w:tcMar>
+              <w:top w:w="90" w:type="dxa"/>
+              <w:start w:w="100" w:type="dxa"/>
+              <w:bottom w:w="90" w:type="dxa"/>
+              <w:end w:w="100" w:type="dxa"/>
+            </w:tcMar>
+            <w:shd w:fill="FFFFFF"/>
+          </w:tcPr>
+          <w:p>
+            <w:pPr>
+              <w:spacing w:after="0"/>
+            </w:pPr>
+            <w:r>
+              <w:rPr>
+                <w:rFonts w:ascii="Microsoft YaHei" w:hAnsi="Microsoft YaHei" w:eastAsia="Microsoft YaHei"/>
+                <w:b w:val="0"/>
+                <w:color w:val="202A35"/>
+                <w:sz w:val="16"/>
+              </w:rPr>
+              <w:t>✅ 完成</w:t>
+            </w:r>
+          </w:p>
+        </w:tc>
+        <w:tc>
+          <w:tcPr>
+            <w:tcW w:type="dxa" w:w="3137"/>
+            <w:vAlign w:val="center"/>
+            <w:tcMar>
+              <w:top w:w="90" w:type="dxa"/>
+              <w:start w:w="100" w:type="dxa"/>
+              <w:bottom w:w="90" w:type="dxa"/>
+              <w:end w:w="100" w:type="dxa"/>
+            </w:tcMar>
+            <w:shd w:fill="FFFFFF"/>
+          </w:tcPr>
+          <w:p>
+            <w:pPr>
+              <w:spacing w:after="0"/>
+            </w:pPr>
+            <w:r>
+              <w:rPr>
+                <w:rFonts w:ascii="Microsoft YaHei" w:hAnsi="Microsoft YaHei" w:eastAsia="Microsoft YaHei"/>
+                <w:b w:val="0"/>
+                <w:color w:val="202A35"/>
+                <w:sz w:val="16"/>
+              </w:rPr>
+              <w:t>results/</w:t>
+            </w:r>
+            <w:r>
+              <w:rPr>
+                <w:rFonts w:ascii="Microsoft YaHei" w:hAnsi="Microsoft YaHei" w:eastAsia="Microsoft YaHei"/>
+                <w:b w:val="0"/>
+                <w:color w:val="202A35"/>
+                <w:sz w:val="16"/>
+              </w:rPr>
+              <w:t xml:space="preserve"> + </w:t>
+            </w:r>
+            <w:r>
+              <w:rPr>
+                <w:rFonts w:ascii="Microsoft YaHei" w:hAnsi="Microsoft YaHei" w:eastAsia="Microsoft YaHei"/>
+                <w:b w:val="0"/>
+                <w:color w:val="202A35"/>
+                <w:sz w:val="16"/>
+              </w:rPr>
+              <w:t>visualization/</w:t>
+            </w:r>
+          </w:p>
+        </w:tc>
+      </w:tr>
+      <w:tr>
+        <w:tc>
+          <w:tcPr>
+            <w:tcW w:type="dxa" w:w="3137"/>
+            <w:vAlign w:val="center"/>
+            <w:tcMar>
+              <w:top w:w="90" w:type="dxa"/>
+              <w:start w:w="100" w:type="dxa"/>
+              <w:bottom w:w="90" w:type="dxa"/>
+              <w:end w:w="100" w:type="dxa"/>
+            </w:tcMar>
+            <w:shd w:fill="F2F5F7"/>
+          </w:tcPr>
+          <w:p>
+            <w:pPr>
+              <w:spacing w:after="0"/>
+            </w:pPr>
+            <w:r>
+              <w:rPr>
+                <w:rFonts w:ascii="Microsoft YaHei" w:hAnsi="Microsoft YaHei" w:eastAsia="Microsoft YaHei"/>
+                <w:b w:val="0"/>
+                <w:color w:val="202A35"/>
+                <w:sz w:val="16"/>
+              </w:rPr>
+              <w:t>论文核心文本草稿（中英文摘要、方法、结果、讨论）</w:t>
+            </w:r>
+          </w:p>
+        </w:tc>
+        <w:tc>
+          <w:tcPr>
+            <w:tcW w:type="dxa" w:w="3137"/>
+            <w:vAlign w:val="center"/>
+            <w:tcMar>
+              <w:top w:w="90" w:type="dxa"/>
+              <w:start w:w="100" w:type="dxa"/>
+              <w:bottom w:w="90" w:type="dxa"/>
+              <w:end w:w="100" w:type="dxa"/>
+            </w:tcMar>
+            <w:shd w:fill="F2F5F7"/>
+          </w:tcPr>
+          <w:p>
+            <w:pPr>
+              <w:spacing w:after="0"/>
+            </w:pPr>
+            <w:r>
+              <w:rPr>
+                <w:rFonts w:ascii="Microsoft YaHei" w:hAnsi="Microsoft YaHei" w:eastAsia="Microsoft YaHei"/>
+                <w:b w:val="0"/>
+                <w:color w:val="202A35"/>
+                <w:sz w:val="16"/>
+              </w:rPr>
+              <w:t>✅ 完成</w:t>
+            </w:r>
+          </w:p>
+        </w:tc>
+        <w:tc>
+          <w:tcPr>
+            <w:tcW w:type="dxa" w:w="3137"/>
+            <w:vAlign w:val="center"/>
+            <w:tcMar>
+              <w:top w:w="90" w:type="dxa"/>
+              <w:start w:w="100" w:type="dxa"/>
+              <w:bottom w:w="90" w:type="dxa"/>
+              <w:end w:w="100" w:type="dxa"/>
+            </w:tcMar>
+            <w:shd w:fill="F2F5F7"/>
+          </w:tcPr>
+          <w:p>
+            <w:pPr>
+              <w:spacing w:after="0"/>
+            </w:pPr>
+            <w:r>
+              <w:rPr>
+                <w:rFonts w:ascii="Microsoft YaHei" w:hAnsi="Microsoft YaHei" w:eastAsia="Microsoft YaHei"/>
+                <w:b w:val="0"/>
+                <w:color w:val="202A35"/>
+                <w:sz w:val="16"/>
+              </w:rPr>
+              <w:t>paper/DREAMER_NRC_论文核心文本草稿.md</w:t>
+            </w:r>
+          </w:p>
+        </w:tc>
+      </w:tr>
+      <w:tr>
+        <w:tc>
+          <w:tcPr>
+            <w:tcW w:type="dxa" w:w="3137"/>
+            <w:vAlign w:val="center"/>
+            <w:tcMar>
+              <w:top w:w="90" w:type="dxa"/>
+              <w:start w:w="100" w:type="dxa"/>
+              <w:bottom w:w="90" w:type="dxa"/>
+              <w:end w:w="100" w:type="dxa"/>
+            </w:tcMar>
+            <w:shd w:fill="FFFFFF"/>
+          </w:tcPr>
+          <w:p>
+            <w:pPr>
+              <w:spacing w:after="0"/>
+            </w:pPr>
+            <w:r>
+              <w:rPr>
+                <w:rFonts w:ascii="Microsoft YaHei" w:hAnsi="Microsoft YaHei" w:eastAsia="Microsoft YaHei"/>
+                <w:b w:val="0"/>
+                <w:color w:val="202A35"/>
+                <w:sz w:val="16"/>
+              </w:rPr>
+              <w:t>A2实验设计（方案、材料、随机表、管线、伦理草案）</w:t>
+            </w:r>
+          </w:p>
+        </w:tc>
+        <w:tc>
+          <w:tcPr>
+            <w:tcW w:type="dxa" w:w="3137"/>
+            <w:vAlign w:val="center"/>
+            <w:tcMar>
+              <w:top w:w="90" w:type="dxa"/>
+              <w:start w:w="100" w:type="dxa"/>
+              <w:bottom w:w="90" w:type="dxa"/>
+              <w:end w:w="100" w:type="dxa"/>
+            </w:tcMar>
+            <w:shd w:fill="FFFFFF"/>
+          </w:tcPr>
+          <w:p>
+            <w:pPr>
+              <w:spacing w:after="0"/>
+            </w:pPr>
+            <w:r>
+              <w:rPr>
+                <w:rFonts w:ascii="Microsoft YaHei" w:hAnsi="Microsoft YaHei" w:eastAsia="Microsoft YaHei"/>
+                <w:b w:val="0"/>
+                <w:color w:val="202A35"/>
+                <w:sz w:val="16"/>
+              </w:rPr>
+              <w:t>✅ 完成</w:t>
+            </w:r>
+          </w:p>
+        </w:tc>
+        <w:tc>
+          <w:tcPr>
+            <w:tcW w:type="dxa" w:w="3137"/>
+            <w:vAlign w:val="center"/>
+            <w:tcMar>
+              <w:top w:w="90" w:type="dxa"/>
+              <w:start w:w="100" w:type="dxa"/>
+              <w:bottom w:w="90" w:type="dxa"/>
+              <w:end w:w="100" w:type="dxa"/>
+            </w:tcMar>
+            <w:shd w:fill="FFFFFF"/>
+          </w:tcPr>
+          <w:p>
+            <w:pPr>
+              <w:spacing w:after="0"/>
+            </w:pPr>
+            <w:r>
+              <w:rPr>
+                <w:rFonts w:ascii="Microsoft YaHei" w:hAnsi="Microsoft YaHei" w:eastAsia="Microsoft YaHei"/>
+                <w:b w:val="0"/>
+                <w:color w:val="202A35"/>
+                <w:sz w:val="16"/>
+              </w:rPr>
+              <w:t>A2_研究主方案.md</w:t>
+            </w:r>
+            <w:r>
+              <w:rPr>
+                <w:rFonts w:ascii="Microsoft YaHei" w:hAnsi="Microsoft YaHei" w:eastAsia="Microsoft YaHei"/>
+                <w:b w:val="0"/>
+                <w:color w:val="202A35"/>
+                <w:sz w:val="16"/>
+              </w:rPr>
+              <w:t xml:space="preserve"> 等</w:t>
+            </w:r>
+          </w:p>
+        </w:tc>
+      </w:tr>
+    </w:tbl>
     <w:p>
       <w:pPr>
-        <w:pStyle w:val="ListNumber"/>
-        <w:ind w:left="397"/>
+        <w:spacing w:after="20"/>
       </w:pPr>
-      <w:r>
-        <w:rPr>
-          <w:rFonts w:ascii="Microsoft YaHei" w:hAnsi="Microsoft YaHei" w:eastAsia="Microsoft YaHei"/>
-        </w:rPr>
-        <w:t>用置换检验和 bootstrap 检验 9 类情绪相关及排名的稳定性。</w:t>
-      </w:r>
-    </w:p>
-    <w:p>
-      <w:pPr>
-        <w:pStyle w:val="ListNumber"/>
-        <w:ind w:left="397"/>
-      </w:pPr>
-      <w:r>
-        <w:rPr>
-          <w:rFonts w:ascii="Microsoft YaHei" w:hAnsi="Microsoft YaHei" w:eastAsia="Microsoft YaHei"/>
-        </w:rPr>
-        <w:t>进行逐类删除敏感性分析，识别结果是否由 surprise、calmness 等单类驱动。</w:t>
-      </w:r>
-    </w:p>
-    <w:p>
-      <w:pPr>
-        <w:pStyle w:val="ListNumber"/>
-        <w:ind w:left="397"/>
-      </w:pPr>
-      <w:r>
-        <w:rPr>
-          <w:rFonts w:ascii="Microsoft YaHei" w:hAnsi="Microsoft YaHei" w:eastAsia="Microsoft YaHei"/>
-        </w:rPr>
-        <w:t>核实 DREAMER 原始 SAM Dominance 图示方向，固定主编码并保留反向敏感性结果。</w:t>
-      </w:r>
-    </w:p>
-    <w:p>
-      <w:pPr>
-        <w:pStyle w:val="ListNumber"/>
-        <w:ind w:left="397"/>
-      </w:pPr>
-      <w:r>
-        <w:rPr>
-          <w:rFonts w:ascii="Microsoft YaHei" w:hAnsi="Microsoft YaHei" w:eastAsia="Microsoft YaHei"/>
-        </w:rPr>
-        <w:t>将名词设为主分析、形容词设为敏感性分析，并在方法中解释词项选择原则。</w:t>
-      </w:r>
-    </w:p>
-    <w:p>
-      <w:pPr>
-        <w:pStyle w:val="ListNumber"/>
-        <w:ind w:left="397"/>
-      </w:pPr>
-      <w:r>
-        <w:rPr>
-          <w:rFonts w:ascii="Microsoft YaHei" w:hAnsi="Microsoft YaHei" w:eastAsia="Microsoft YaHei"/>
-        </w:rPr>
-        <w:t>为 NRC 坐标不确定性建立可行的误差传播或局限说明。</w:t>
-      </w:r>
     </w:p>
     <w:p>
       <w:pPr>
@@ -3444,68 +5602,925 @@
         <w:rPr>
           <w:rFonts w:ascii="Microsoft YaHei" w:hAnsi="Microsoft YaHei" w:eastAsia="Microsoft YaHei"/>
         </w:rPr>
-        <w:t>第二优先级：形成论文完整稿</w:t>
+        <w:t>9.2 未开始（需前置条件）</w:t>
       </w:r>
     </w:p>
+    <w:tbl>
+      <w:tblPr>
+        <w:tblStyle w:val="TableGrid"/>
+        <w:tblW w:type="auto" w:w="0"/>
+        <w:jc w:val="center"/>
+        <w:tblLayout w:type="autofit"/>
+        <w:tblLook w:firstColumn="1" w:firstRow="1" w:lastColumn="0" w:lastRow="0" w:noHBand="0" w:noVBand="1" w:val="04A0"/>
+      </w:tblPr>
+      <w:tblGrid>
+        <w:gridCol w:w="3137"/>
+        <w:gridCol w:w="3137"/>
+        <w:gridCol w:w="3137"/>
+      </w:tblGrid>
+      <w:tr>
+        <w:trPr>
+          <w:tblHeader w:val="true"/>
+        </w:trPr>
+        <w:tc>
+          <w:tcPr>
+            <w:tcW w:type="dxa" w:w="3137"/>
+            <w:vAlign w:val="center"/>
+            <w:tcMar>
+              <w:top w:w="90" w:type="dxa"/>
+              <w:start w:w="100" w:type="dxa"/>
+              <w:bottom w:w="90" w:type="dxa"/>
+              <w:end w:w="100" w:type="dxa"/>
+            </w:tcMar>
+            <w:shd w:fill="202A35"/>
+          </w:tcPr>
+          <w:p>
+            <w:pPr>
+              <w:spacing w:after="0"/>
+            </w:pPr>
+            <w:r>
+              <w:rPr>
+                <w:rFonts w:ascii="Microsoft YaHei" w:hAnsi="Microsoft YaHei" w:eastAsia="Microsoft YaHei"/>
+                <w:b/>
+                <w:color w:val="FFFFFF"/>
+                <w:sz w:val="16"/>
+              </w:rPr>
+              <w:t>工作项</w:t>
+            </w:r>
+          </w:p>
+        </w:tc>
+        <w:tc>
+          <w:tcPr>
+            <w:tcW w:type="dxa" w:w="3137"/>
+            <w:vAlign w:val="center"/>
+            <w:tcMar>
+              <w:top w:w="90" w:type="dxa"/>
+              <w:start w:w="100" w:type="dxa"/>
+              <w:bottom w:w="90" w:type="dxa"/>
+              <w:end w:w="100" w:type="dxa"/>
+            </w:tcMar>
+            <w:shd w:fill="202A35"/>
+          </w:tcPr>
+          <w:p>
+            <w:pPr>
+              <w:spacing w:after="0"/>
+            </w:pPr>
+            <w:r>
+              <w:rPr>
+                <w:rFonts w:ascii="Microsoft YaHei" w:hAnsi="Microsoft YaHei" w:eastAsia="Microsoft YaHei"/>
+                <w:b/>
+                <w:color w:val="FFFFFF"/>
+                <w:sz w:val="16"/>
+              </w:rPr>
+              <w:t>阻塞条件</w:t>
+            </w:r>
+          </w:p>
+        </w:tc>
+        <w:tc>
+          <w:tcPr>
+            <w:tcW w:type="dxa" w:w="3137"/>
+            <w:vAlign w:val="center"/>
+            <w:tcMar>
+              <w:top w:w="90" w:type="dxa"/>
+              <w:start w:w="100" w:type="dxa"/>
+              <w:bottom w:w="90" w:type="dxa"/>
+              <w:end w:w="100" w:type="dxa"/>
+            </w:tcMar>
+            <w:shd w:fill="202A35"/>
+          </w:tcPr>
+          <w:p>
+            <w:pPr>
+              <w:spacing w:after="0"/>
+            </w:pPr>
+            <w:r>
+              <w:rPr>
+                <w:rFonts w:ascii="Microsoft YaHei" w:hAnsi="Microsoft YaHei" w:eastAsia="Microsoft YaHei"/>
+                <w:b/>
+                <w:color w:val="FFFFFF"/>
+                <w:sz w:val="16"/>
+              </w:rPr>
+              <w:t>预计启动时机</w:t>
+            </w:r>
+          </w:p>
+        </w:tc>
+      </w:tr>
+      <w:tr>
+        <w:tc>
+          <w:tcPr>
+            <w:tcW w:type="dxa" w:w="3137"/>
+            <w:vAlign w:val="center"/>
+            <w:tcMar>
+              <w:top w:w="90" w:type="dxa"/>
+              <w:start w:w="100" w:type="dxa"/>
+              <w:bottom w:w="90" w:type="dxa"/>
+              <w:end w:w="100" w:type="dxa"/>
+            </w:tcMar>
+            <w:shd w:fill="FFFFFF"/>
+          </w:tcPr>
+          <w:p>
+            <w:pPr>
+              <w:spacing w:after="0"/>
+            </w:pPr>
+            <w:r>
+              <w:rPr>
+                <w:rFonts w:ascii="Microsoft YaHei" w:hAnsi="Microsoft YaHei" w:eastAsia="Microsoft YaHei"/>
+                <w:b w:val="0"/>
+                <w:color w:val="202A35"/>
+                <w:sz w:val="16"/>
+              </w:rPr>
+              <w:t>DREAMER原始SAM Dominance界面方向核验</w:t>
+            </w:r>
+          </w:p>
+        </w:tc>
+        <w:tc>
+          <w:tcPr>
+            <w:tcW w:type="dxa" w:w="3137"/>
+            <w:vAlign w:val="center"/>
+            <w:tcMar>
+              <w:top w:w="90" w:type="dxa"/>
+              <w:start w:w="100" w:type="dxa"/>
+              <w:bottom w:w="90" w:type="dxa"/>
+              <w:end w:w="100" w:type="dxa"/>
+            </w:tcMar>
+            <w:shd w:fill="FFFFFF"/>
+          </w:tcPr>
+          <w:p>
+            <w:pPr>
+              <w:spacing w:after="0"/>
+            </w:pPr>
+            <w:r>
+              <w:rPr>
+                <w:rFonts w:ascii="Microsoft YaHei" w:hAnsi="Microsoft YaHei" w:eastAsia="Microsoft YaHei"/>
+                <w:b w:val="0"/>
+                <w:color w:val="202A35"/>
+                <w:sz w:val="16"/>
+              </w:rPr>
+              <w:t>需获取原始材料</w:t>
+            </w:r>
+          </w:p>
+        </w:tc>
+        <w:tc>
+          <w:tcPr>
+            <w:tcW w:type="dxa" w:w="3137"/>
+            <w:vAlign w:val="center"/>
+            <w:tcMar>
+              <w:top w:w="90" w:type="dxa"/>
+              <w:start w:w="100" w:type="dxa"/>
+              <w:bottom w:w="90" w:type="dxa"/>
+              <w:end w:w="100" w:type="dxa"/>
+            </w:tcMar>
+            <w:shd w:fill="FFFFFF"/>
+          </w:tcPr>
+          <w:p>
+            <w:pPr>
+              <w:spacing w:after="0"/>
+            </w:pPr>
+            <w:r>
+              <w:rPr>
+                <w:rFonts w:ascii="Microsoft YaHei" w:hAnsi="Microsoft YaHei" w:eastAsia="Microsoft YaHei"/>
+                <w:b w:val="0"/>
+                <w:color w:val="202A35"/>
+                <w:sz w:val="16"/>
+              </w:rPr>
+              <w:t>投稿前必须完成</w:t>
+            </w:r>
+          </w:p>
+        </w:tc>
+      </w:tr>
+      <w:tr>
+        <w:tc>
+          <w:tcPr>
+            <w:tcW w:type="dxa" w:w="3137"/>
+            <w:vAlign w:val="center"/>
+            <w:tcMar>
+              <w:top w:w="90" w:type="dxa"/>
+              <w:start w:w="100" w:type="dxa"/>
+              <w:bottom w:w="90" w:type="dxa"/>
+              <w:end w:w="100" w:type="dxa"/>
+            </w:tcMar>
+            <w:shd w:fill="F2F5F7"/>
+          </w:tcPr>
+          <w:p>
+            <w:pPr>
+              <w:spacing w:after="0"/>
+            </w:pPr>
+            <w:r>
+              <w:rPr>
+                <w:rFonts w:ascii="Microsoft YaHei" w:hAnsi="Microsoft YaHei" w:eastAsia="Microsoft YaHei"/>
+                <w:b w:val="0"/>
+                <w:color w:val="202A35"/>
+                <w:sz w:val="16"/>
+              </w:rPr>
+              <w:t>目标期刊格式适配 + 独立统计复核</w:t>
+            </w:r>
+          </w:p>
+        </w:tc>
+        <w:tc>
+          <w:tcPr>
+            <w:tcW w:type="dxa" w:w="3137"/>
+            <w:vAlign w:val="center"/>
+            <w:tcMar>
+              <w:top w:w="90" w:type="dxa"/>
+              <w:start w:w="100" w:type="dxa"/>
+              <w:bottom w:w="90" w:type="dxa"/>
+              <w:end w:w="100" w:type="dxa"/>
+            </w:tcMar>
+            <w:shd w:fill="F2F5F7"/>
+          </w:tcPr>
+          <w:p>
+            <w:pPr>
+              <w:spacing w:after="0"/>
+            </w:pPr>
+            <w:r>
+              <w:rPr>
+                <w:rFonts w:ascii="Microsoft YaHei" w:hAnsi="Microsoft YaHei" w:eastAsia="Microsoft YaHei"/>
+                <w:b w:val="0"/>
+                <w:color w:val="202A35"/>
+                <w:sz w:val="16"/>
+              </w:rPr>
+              <w:t>需先确定目标期刊</w:t>
+            </w:r>
+          </w:p>
+        </w:tc>
+        <w:tc>
+          <w:tcPr>
+            <w:tcW w:type="dxa" w:w="3137"/>
+            <w:vAlign w:val="center"/>
+            <w:tcMar>
+              <w:top w:w="90" w:type="dxa"/>
+              <w:start w:w="100" w:type="dxa"/>
+              <w:bottom w:w="90" w:type="dxa"/>
+              <w:end w:w="100" w:type="dxa"/>
+            </w:tcMar>
+            <w:shd w:fill="F2F5F7"/>
+          </w:tcPr>
+          <w:p>
+            <w:pPr>
+              <w:spacing w:after="0"/>
+            </w:pPr>
+            <w:r>
+              <w:rPr>
+                <w:rFonts w:ascii="Microsoft YaHei" w:hAnsi="Microsoft YaHei" w:eastAsia="Microsoft YaHei"/>
+                <w:b w:val="0"/>
+                <w:color w:val="202A35"/>
+                <w:sz w:val="16"/>
+              </w:rPr>
+              <w:t>Dominance核验后</w:t>
+            </w:r>
+          </w:p>
+        </w:tc>
+      </w:tr>
+      <w:tr>
+        <w:tc>
+          <w:tcPr>
+            <w:tcW w:type="dxa" w:w="3137"/>
+            <w:vAlign w:val="center"/>
+            <w:tcMar>
+              <w:top w:w="90" w:type="dxa"/>
+              <w:start w:w="100" w:type="dxa"/>
+              <w:bottom w:w="90" w:type="dxa"/>
+              <w:end w:w="100" w:type="dxa"/>
+            </w:tcMar>
+            <w:shd w:fill="FFFFFF"/>
+          </w:tcPr>
+          <w:p>
+            <w:pPr>
+              <w:spacing w:after="0"/>
+            </w:pPr>
+            <w:r>
+              <w:rPr>
+                <w:rFonts w:ascii="Microsoft YaHei" w:hAnsi="Microsoft YaHei" w:eastAsia="Microsoft YaHei"/>
+                <w:b w:val="0"/>
+                <w:color w:val="202A35"/>
+                <w:sz w:val="16"/>
+              </w:rPr>
+              <w:t>A2三层对齐实验——全部内容</w:t>
+            </w:r>
+          </w:p>
+        </w:tc>
+        <w:tc>
+          <w:tcPr>
+            <w:tcW w:type="dxa" w:w="3137"/>
+            <w:vAlign w:val="center"/>
+            <w:tcMar>
+              <w:top w:w="90" w:type="dxa"/>
+              <w:start w:w="100" w:type="dxa"/>
+              <w:bottom w:w="90" w:type="dxa"/>
+              <w:end w:w="100" w:type="dxa"/>
+            </w:tcMar>
+            <w:shd w:fill="FFFFFF"/>
+          </w:tcPr>
+          <w:p>
+            <w:pPr>
+              <w:spacing w:after="0"/>
+            </w:pPr>
+          </w:p>
+        </w:tc>
+        <w:tc>
+          <w:tcPr>
+            <w:tcW w:type="dxa" w:w="3137"/>
+            <w:vAlign w:val="center"/>
+            <w:tcMar>
+              <w:top w:w="90" w:type="dxa"/>
+              <w:start w:w="100" w:type="dxa"/>
+              <w:bottom w:w="90" w:type="dxa"/>
+              <w:end w:w="100" w:type="dxa"/>
+            </w:tcMar>
+            <w:shd w:fill="FFFFFF"/>
+          </w:tcPr>
+          <w:p>
+            <w:pPr>
+              <w:spacing w:after="0"/>
+            </w:pPr>
+          </w:p>
+        </w:tc>
+      </w:tr>
+      <w:tr>
+        <w:tc>
+          <w:tcPr>
+            <w:tcW w:type="dxa" w:w="3137"/>
+            <w:vAlign w:val="center"/>
+            <w:tcMar>
+              <w:top w:w="90" w:type="dxa"/>
+              <w:start w:w="100" w:type="dxa"/>
+              <w:bottom w:w="90" w:type="dxa"/>
+              <w:end w:w="100" w:type="dxa"/>
+            </w:tcMar>
+            <w:shd w:fill="F2F5F7"/>
+          </w:tcPr>
+          <w:p>
+            <w:pPr>
+              <w:spacing w:after="0"/>
+            </w:pPr>
+            <w:r>
+              <w:rPr>
+                <w:rFonts w:ascii="Microsoft YaHei" w:hAnsi="Microsoft YaHei" w:eastAsia="Microsoft YaHei"/>
+                <w:b w:val="0"/>
+                <w:color w:val="202A35"/>
+                <w:sz w:val="16"/>
+              </w:rPr>
+              <w:t>└ 伦理审批</w:t>
+            </w:r>
+          </w:p>
+        </w:tc>
+        <w:tc>
+          <w:tcPr>
+            <w:tcW w:type="dxa" w:w="3137"/>
+            <w:vAlign w:val="center"/>
+            <w:tcMar>
+              <w:top w:w="90" w:type="dxa"/>
+              <w:start w:w="100" w:type="dxa"/>
+              <w:bottom w:w="90" w:type="dxa"/>
+              <w:end w:w="100" w:type="dxa"/>
+            </w:tcMar>
+            <w:shd w:fill="F2F5F7"/>
+          </w:tcPr>
+          <w:p>
+            <w:pPr>
+              <w:spacing w:after="0"/>
+            </w:pPr>
+            <w:r>
+              <w:rPr>
+                <w:rFonts w:ascii="Microsoft YaHei" w:hAnsi="Microsoft YaHei" w:eastAsia="Microsoft YaHei"/>
+                <w:b w:val="0"/>
+                <w:color w:val="202A35"/>
+                <w:sz w:val="16"/>
+              </w:rPr>
+              <w:t>需提交伦理委员会</w:t>
+            </w:r>
+          </w:p>
+        </w:tc>
+        <w:tc>
+          <w:tcPr>
+            <w:tcW w:type="dxa" w:w="3137"/>
+            <w:vAlign w:val="center"/>
+            <w:tcMar>
+              <w:top w:w="90" w:type="dxa"/>
+              <w:start w:w="100" w:type="dxa"/>
+              <w:bottom w:w="90" w:type="dxa"/>
+              <w:end w:w="100" w:type="dxa"/>
+            </w:tcMar>
+            <w:shd w:fill="F2F5F7"/>
+          </w:tcPr>
+          <w:p>
+            <w:pPr>
+              <w:spacing w:after="0"/>
+            </w:pPr>
+            <w:r>
+              <w:rPr>
+                <w:rFonts w:ascii="Microsoft YaHei" w:hAnsi="Microsoft YaHei" w:eastAsia="Microsoft YaHei"/>
+                <w:b w:val="0"/>
+                <w:color w:val="202A35"/>
+                <w:sz w:val="16"/>
+              </w:rPr>
+              <w:t>待推进</w:t>
+            </w:r>
+          </w:p>
+        </w:tc>
+      </w:tr>
+      <w:tr>
+        <w:tc>
+          <w:tcPr>
+            <w:tcW w:type="dxa" w:w="3137"/>
+            <w:vAlign w:val="center"/>
+            <w:tcMar>
+              <w:top w:w="90" w:type="dxa"/>
+              <w:start w:w="100" w:type="dxa"/>
+              <w:bottom w:w="90" w:type="dxa"/>
+              <w:end w:w="100" w:type="dxa"/>
+            </w:tcMar>
+            <w:shd w:fill="FFFFFF"/>
+          </w:tcPr>
+          <w:p>
+            <w:pPr>
+              <w:spacing w:after="0"/>
+            </w:pPr>
+            <w:r>
+              <w:rPr>
+                <w:rFonts w:ascii="Microsoft YaHei" w:hAnsi="Microsoft YaHei" w:eastAsia="Microsoft YaHei"/>
+                <w:b w:val="0"/>
+                <w:color w:val="202A35"/>
+                <w:sz w:val="16"/>
+              </w:rPr>
+              <w:t>└ 设备同步验证（EDA+ECG/PPG）</w:t>
+            </w:r>
+          </w:p>
+        </w:tc>
+        <w:tc>
+          <w:tcPr>
+            <w:tcW w:type="dxa" w:w="3137"/>
+            <w:vAlign w:val="center"/>
+            <w:tcMar>
+              <w:top w:w="90" w:type="dxa"/>
+              <w:start w:w="100" w:type="dxa"/>
+              <w:bottom w:w="90" w:type="dxa"/>
+              <w:end w:w="100" w:type="dxa"/>
+            </w:tcMar>
+            <w:shd w:fill="FFFFFF"/>
+          </w:tcPr>
+          <w:p>
+            <w:pPr>
+              <w:spacing w:after="0"/>
+            </w:pPr>
+            <w:r>
+              <w:rPr>
+                <w:rFonts w:ascii="Microsoft YaHei" w:hAnsi="Microsoft YaHei" w:eastAsia="Microsoft YaHei"/>
+                <w:b w:val="0"/>
+                <w:color w:val="202A35"/>
+                <w:sz w:val="16"/>
+              </w:rPr>
+              <w:t>需硬件到位+LSL/串口调试</w:t>
+            </w:r>
+          </w:p>
+        </w:tc>
+        <w:tc>
+          <w:tcPr>
+            <w:tcW w:type="dxa" w:w="3137"/>
+            <w:vAlign w:val="center"/>
+            <w:tcMar>
+              <w:top w:w="90" w:type="dxa"/>
+              <w:start w:w="100" w:type="dxa"/>
+              <w:bottom w:w="90" w:type="dxa"/>
+              <w:end w:w="100" w:type="dxa"/>
+            </w:tcMar>
+            <w:shd w:fill="FFFFFF"/>
+          </w:tcPr>
+          <w:p>
+            <w:pPr>
+              <w:spacing w:after="0"/>
+            </w:pPr>
+            <w:r>
+              <w:rPr>
+                <w:rFonts w:ascii="Microsoft YaHei" w:hAnsi="Microsoft YaHei" w:eastAsia="Microsoft YaHei"/>
+                <w:b w:val="0"/>
+                <w:color w:val="202A35"/>
+                <w:sz w:val="16"/>
+              </w:rPr>
+              <w:t>伦理审批后</w:t>
+            </w:r>
+          </w:p>
+        </w:tc>
+      </w:tr>
+      <w:tr>
+        <w:tc>
+          <w:tcPr>
+            <w:tcW w:type="dxa" w:w="3137"/>
+            <w:vAlign w:val="center"/>
+            <w:tcMar>
+              <w:top w:w="90" w:type="dxa"/>
+              <w:start w:w="100" w:type="dxa"/>
+              <w:bottom w:w="90" w:type="dxa"/>
+              <w:end w:w="100" w:type="dxa"/>
+            </w:tcMar>
+            <w:shd w:fill="F2F5F7"/>
+          </w:tcPr>
+          <w:p>
+            <w:pPr>
+              <w:spacing w:after="0"/>
+            </w:pPr>
+            <w:r>
+              <w:rPr>
+                <w:rFonts w:ascii="Microsoft YaHei" w:hAnsi="Microsoft YaHei" w:eastAsia="Microsoft YaHei"/>
+                <w:b w:val="0"/>
+                <w:color w:val="202A35"/>
+                <w:sz w:val="16"/>
+              </w:rPr>
+              <w:t>└ 8-12人预测试 + 刺激冻结</w:t>
+            </w:r>
+          </w:p>
+        </w:tc>
+        <w:tc>
+          <w:tcPr>
+            <w:tcW w:type="dxa" w:w="3137"/>
+            <w:vAlign w:val="center"/>
+            <w:tcMar>
+              <w:top w:w="90" w:type="dxa"/>
+              <w:start w:w="100" w:type="dxa"/>
+              <w:bottom w:w="90" w:type="dxa"/>
+              <w:end w:w="100" w:type="dxa"/>
+            </w:tcMar>
+            <w:shd w:fill="F2F5F7"/>
+          </w:tcPr>
+          <w:p>
+            <w:pPr>
+              <w:spacing w:after="0"/>
+            </w:pPr>
+            <w:r>
+              <w:rPr>
+                <w:rFonts w:ascii="Microsoft YaHei" w:hAnsi="Microsoft YaHei" w:eastAsia="Microsoft YaHei"/>
+                <w:b w:val="0"/>
+                <w:color w:val="202A35"/>
+                <w:sz w:val="16"/>
+              </w:rPr>
+              <w:t>需伦理+设备+参与者</w:t>
+            </w:r>
+          </w:p>
+        </w:tc>
+        <w:tc>
+          <w:tcPr>
+            <w:tcW w:type="dxa" w:w="3137"/>
+            <w:vAlign w:val="center"/>
+            <w:tcMar>
+              <w:top w:w="90" w:type="dxa"/>
+              <w:start w:w="100" w:type="dxa"/>
+              <w:bottom w:w="90" w:type="dxa"/>
+              <w:end w:w="100" w:type="dxa"/>
+            </w:tcMar>
+            <w:shd w:fill="F2F5F7"/>
+          </w:tcPr>
+          <w:p>
+            <w:pPr>
+              <w:spacing w:after="0"/>
+            </w:pPr>
+            <w:r>
+              <w:rPr>
+                <w:rFonts w:ascii="Microsoft YaHei" w:hAnsi="Microsoft YaHei" w:eastAsia="Microsoft YaHei"/>
+                <w:b w:val="0"/>
+                <w:color w:val="202A35"/>
+                <w:sz w:val="16"/>
+              </w:rPr>
+              <w:t>设备就绪后</w:t>
+            </w:r>
+          </w:p>
+        </w:tc>
+      </w:tr>
+      <w:tr>
+        <w:tc>
+          <w:tcPr>
+            <w:tcW w:type="dxa" w:w="3137"/>
+            <w:vAlign w:val="center"/>
+            <w:tcMar>
+              <w:top w:w="90" w:type="dxa"/>
+              <w:start w:w="100" w:type="dxa"/>
+              <w:bottom w:w="90" w:type="dxa"/>
+              <w:end w:w="100" w:type="dxa"/>
+            </w:tcMar>
+            <w:shd w:fill="FFFFFF"/>
+          </w:tcPr>
+          <w:p>
+            <w:pPr>
+              <w:spacing w:after="0"/>
+            </w:pPr>
+            <w:r>
+              <w:rPr>
+                <w:rFonts w:ascii="Microsoft YaHei" w:hAnsi="Microsoft YaHei" w:eastAsia="Microsoft YaHei"/>
+                <w:b w:val="0"/>
+                <w:color w:val="202A35"/>
+                <w:sz w:val="16"/>
+              </w:rPr>
+              <w:t>└ 正式招募36-45人 + 两场次采集</w:t>
+            </w:r>
+          </w:p>
+        </w:tc>
+        <w:tc>
+          <w:tcPr>
+            <w:tcW w:type="dxa" w:w="3137"/>
+            <w:vAlign w:val="center"/>
+            <w:tcMar>
+              <w:top w:w="90" w:type="dxa"/>
+              <w:start w:w="100" w:type="dxa"/>
+              <w:bottom w:w="90" w:type="dxa"/>
+              <w:end w:w="100" w:type="dxa"/>
+            </w:tcMar>
+            <w:shd w:fill="FFFFFF"/>
+          </w:tcPr>
+          <w:p>
+            <w:pPr>
+              <w:spacing w:after="0"/>
+            </w:pPr>
+            <w:r>
+              <w:rPr>
+                <w:rFonts w:ascii="Microsoft YaHei" w:hAnsi="Microsoft YaHei" w:eastAsia="Microsoft YaHei"/>
+                <w:b w:val="0"/>
+                <w:color w:val="202A35"/>
+                <w:sz w:val="16"/>
+              </w:rPr>
+              <w:t>需预测试通过</w:t>
+            </w:r>
+          </w:p>
+        </w:tc>
+        <w:tc>
+          <w:tcPr>
+            <w:tcW w:type="dxa" w:w="3137"/>
+            <w:vAlign w:val="center"/>
+            <w:tcMar>
+              <w:top w:w="90" w:type="dxa"/>
+              <w:start w:w="100" w:type="dxa"/>
+              <w:bottom w:w="90" w:type="dxa"/>
+              <w:end w:w="100" w:type="dxa"/>
+            </w:tcMar>
+            <w:shd w:fill="FFFFFF"/>
+          </w:tcPr>
+          <w:p>
+            <w:pPr>
+              <w:spacing w:after="0"/>
+            </w:pPr>
+            <w:r>
+              <w:rPr>
+                <w:rFonts w:ascii="Microsoft YaHei" w:hAnsi="Microsoft YaHei" w:eastAsia="Microsoft YaHei"/>
+                <w:b w:val="0"/>
+                <w:color w:val="202A35"/>
+                <w:sz w:val="16"/>
+              </w:rPr>
+              <w:t>预测试后</w:t>
+            </w:r>
+          </w:p>
+        </w:tc>
+      </w:tr>
+      <w:tr>
+        <w:tc>
+          <w:tcPr>
+            <w:tcW w:type="dxa" w:w="3137"/>
+            <w:vAlign w:val="center"/>
+            <w:tcMar>
+              <w:top w:w="90" w:type="dxa"/>
+              <w:start w:w="100" w:type="dxa"/>
+              <w:bottom w:w="90" w:type="dxa"/>
+              <w:end w:w="100" w:type="dxa"/>
+            </w:tcMar>
+            <w:shd w:fill="F2F5F7"/>
+          </w:tcPr>
+          <w:p>
+            <w:pPr>
+              <w:spacing w:after="0"/>
+            </w:pPr>
+            <w:r>
+              <w:rPr>
+                <w:rFonts w:ascii="Microsoft YaHei" w:hAnsi="Microsoft YaHei" w:eastAsia="Microsoft YaHei"/>
+                <w:b w:val="0"/>
+                <w:color w:val="202A35"/>
+                <w:sz w:val="16"/>
+              </w:rPr>
+              <w:t>└ 混合模型 + 论文初稿</w:t>
+            </w:r>
+          </w:p>
+        </w:tc>
+        <w:tc>
+          <w:tcPr>
+            <w:tcW w:type="dxa" w:w="3137"/>
+            <w:vAlign w:val="center"/>
+            <w:tcMar>
+              <w:top w:w="90" w:type="dxa"/>
+              <w:start w:w="100" w:type="dxa"/>
+              <w:bottom w:w="90" w:type="dxa"/>
+              <w:end w:w="100" w:type="dxa"/>
+            </w:tcMar>
+            <w:shd w:fill="F2F5F7"/>
+          </w:tcPr>
+          <w:p>
+            <w:pPr>
+              <w:spacing w:after="0"/>
+            </w:pPr>
+            <w:r>
+              <w:rPr>
+                <w:rFonts w:ascii="Microsoft YaHei" w:hAnsi="Microsoft YaHei" w:eastAsia="Microsoft YaHei"/>
+                <w:b w:val="0"/>
+                <w:color w:val="202A35"/>
+                <w:sz w:val="16"/>
+              </w:rPr>
+              <w:t>需完整数据</w:t>
+            </w:r>
+          </w:p>
+        </w:tc>
+        <w:tc>
+          <w:tcPr>
+            <w:tcW w:type="dxa" w:w="3137"/>
+            <w:vAlign w:val="center"/>
+            <w:tcMar>
+              <w:top w:w="90" w:type="dxa"/>
+              <w:start w:w="100" w:type="dxa"/>
+              <w:bottom w:w="90" w:type="dxa"/>
+              <w:end w:w="100" w:type="dxa"/>
+            </w:tcMar>
+            <w:shd w:fill="F2F5F7"/>
+          </w:tcPr>
+          <w:p>
+            <w:pPr>
+              <w:spacing w:after="0"/>
+            </w:pPr>
+            <w:r>
+              <w:rPr>
+                <w:rFonts w:ascii="Microsoft YaHei" w:hAnsi="Microsoft YaHei" w:eastAsia="Microsoft YaHei"/>
+                <w:b w:val="0"/>
+                <w:color w:val="202A35"/>
+                <w:sz w:val="16"/>
+              </w:rPr>
+              <w:t>数据采集后</w:t>
+            </w:r>
+          </w:p>
+        </w:tc>
+      </w:tr>
+      <w:tr>
+        <w:tc>
+          <w:tcPr>
+            <w:tcW w:type="dxa" w:w="3137"/>
+            <w:vAlign w:val="center"/>
+            <w:tcMar>
+              <w:top w:w="90" w:type="dxa"/>
+              <w:start w:w="100" w:type="dxa"/>
+              <w:bottom w:w="90" w:type="dxa"/>
+              <w:end w:w="100" w:type="dxa"/>
+            </w:tcMar>
+            <w:shd w:fill="FFFFFF"/>
+          </w:tcPr>
+          <w:p>
+            <w:pPr>
+              <w:spacing w:after="0"/>
+            </w:pPr>
+            <w:r>
+              <w:rPr>
+                <w:rFonts w:ascii="Microsoft YaHei" w:hAnsi="Microsoft YaHei" w:eastAsia="Microsoft YaHei"/>
+                <w:b w:val="0"/>
+                <w:color w:val="202A35"/>
+                <w:sz w:val="16"/>
+              </w:rPr>
+              <w:t>CASE情绪恢复曲线深化</w:t>
+            </w:r>
+          </w:p>
+        </w:tc>
+        <w:tc>
+          <w:tcPr>
+            <w:tcW w:type="dxa" w:w="3137"/>
+            <w:vAlign w:val="center"/>
+            <w:tcMar>
+              <w:top w:w="90" w:type="dxa"/>
+              <w:start w:w="100" w:type="dxa"/>
+              <w:bottom w:w="90" w:type="dxa"/>
+              <w:end w:w="100" w:type="dxa"/>
+            </w:tcMar>
+            <w:shd w:fill="FFFFFF"/>
+          </w:tcPr>
+          <w:p>
+            <w:pPr>
+              <w:spacing w:after="0"/>
+            </w:pPr>
+            <w:r>
+              <w:rPr>
+                <w:rFonts w:ascii="Microsoft YaHei" w:hAnsi="Microsoft YaHei" w:eastAsia="Microsoft YaHei"/>
+                <w:b w:val="0"/>
+                <w:color w:val="202A35"/>
+                <w:sz w:val="16"/>
+              </w:rPr>
+              <w:t>当前有方法试跑，深化需更多被试/刺激</w:t>
+            </w:r>
+          </w:p>
+        </w:tc>
+        <w:tc>
+          <w:tcPr>
+            <w:tcW w:type="dxa" w:w="3137"/>
+            <w:vAlign w:val="center"/>
+            <w:tcMar>
+              <w:top w:w="90" w:type="dxa"/>
+              <w:start w:w="100" w:type="dxa"/>
+              <w:bottom w:w="90" w:type="dxa"/>
+              <w:end w:w="100" w:type="dxa"/>
+            </w:tcMar>
+            <w:shd w:fill="FFFFFF"/>
+          </w:tcPr>
+          <w:p>
+            <w:pPr>
+              <w:spacing w:after="0"/>
+            </w:pPr>
+            <w:r>
+              <w:rPr>
+                <w:rFonts w:ascii="Microsoft YaHei" w:hAnsi="Microsoft YaHei" w:eastAsia="Microsoft YaHei"/>
+                <w:b w:val="0"/>
+                <w:color w:val="202A35"/>
+                <w:sz w:val="16"/>
+              </w:rPr>
+              <w:t>远期</w:t>
+            </w:r>
+          </w:p>
+        </w:tc>
+      </w:tr>
+      <w:tr>
+        <w:tc>
+          <w:tcPr>
+            <w:tcW w:type="dxa" w:w="3137"/>
+            <w:vAlign w:val="center"/>
+            <w:tcMar>
+              <w:top w:w="90" w:type="dxa"/>
+              <w:start w:w="100" w:type="dxa"/>
+              <w:bottom w:w="90" w:type="dxa"/>
+              <w:end w:w="100" w:type="dxa"/>
+            </w:tcMar>
+            <w:shd w:fill="F2F5F7"/>
+          </w:tcPr>
+          <w:p>
+            <w:pPr>
+              <w:spacing w:after="0"/>
+            </w:pPr>
+            <w:r>
+              <w:rPr>
+                <w:rFonts w:ascii="Microsoft YaHei" w:hAnsi="Microsoft YaHei" w:eastAsia="Microsoft YaHei"/>
+                <w:b w:val="0"/>
+                <w:color w:val="202A35"/>
+                <w:sz w:val="16"/>
+              </w:rPr>
+              <w:t>FAA→Dominance假设的高密度EEG验证</w:t>
+            </w:r>
+          </w:p>
+        </w:tc>
+        <w:tc>
+          <w:tcPr>
+            <w:tcW w:type="dxa" w:w="3137"/>
+            <w:vAlign w:val="center"/>
+            <w:tcMar>
+              <w:top w:w="90" w:type="dxa"/>
+              <w:start w:w="100" w:type="dxa"/>
+              <w:bottom w:w="90" w:type="dxa"/>
+              <w:end w:w="100" w:type="dxa"/>
+            </w:tcMar>
+            <w:shd w:fill="F2F5F7"/>
+          </w:tcPr>
+          <w:p>
+            <w:pPr>
+              <w:spacing w:after="0"/>
+            </w:pPr>
+            <w:r>
+              <w:rPr>
+                <w:rFonts w:ascii="Microsoft YaHei" w:hAnsi="Microsoft YaHei" w:eastAsia="Microsoft YaHei"/>
+                <w:b w:val="0"/>
+                <w:color w:val="202A35"/>
+                <w:sz w:val="16"/>
+              </w:rPr>
+              <w:t>DREAMER的14ch EEG敏感性不足</w:t>
+            </w:r>
+          </w:p>
+        </w:tc>
+        <w:tc>
+          <w:tcPr>
+            <w:tcW w:type="dxa" w:w="3137"/>
+            <w:vAlign w:val="center"/>
+            <w:tcMar>
+              <w:top w:w="90" w:type="dxa"/>
+              <w:start w:w="100" w:type="dxa"/>
+              <w:bottom w:w="90" w:type="dxa"/>
+              <w:end w:w="100" w:type="dxa"/>
+            </w:tcMar>
+            <w:shd w:fill="F2F5F7"/>
+          </w:tcPr>
+          <w:p>
+            <w:pPr>
+              <w:spacing w:after="0"/>
+            </w:pPr>
+            <w:r>
+              <w:rPr>
+                <w:rFonts w:ascii="Microsoft YaHei" w:hAnsi="Microsoft YaHei" w:eastAsia="Microsoft YaHei"/>
+                <w:b w:val="0"/>
+                <w:color w:val="202A35"/>
+                <w:sz w:val="16"/>
+              </w:rPr>
+              <w:t>远期（需设备升级）</w:t>
+            </w:r>
+          </w:p>
+        </w:tc>
+      </w:tr>
+    </w:tbl>
     <w:p>
       <w:pPr>
-        <w:pStyle w:val="ListNumber"/>
-        <w:ind w:left="397"/>
+        <w:spacing w:after="20"/>
       </w:pPr>
-      <w:r>
-        <w:rPr>
-          <w:rFonts w:ascii="Microsoft YaHei" w:hAnsi="Microsoft YaHei" w:eastAsia="Microsoft YaHei"/>
-        </w:rPr>
-        <w:t>以 Valence 强对应、Arousal 压缩/重排、Dominance 不稳定为结果主线。</w:t>
-      </w:r>
-    </w:p>
-    <w:p>
-      <w:pPr>
-        <w:pStyle w:val="ListNumber"/>
-        <w:ind w:left="397"/>
-      </w:pPr>
-      <w:r>
-        <w:rPr>
-          <w:rFonts w:ascii="Microsoft YaHei" w:hAnsi="Microsoft YaHei" w:eastAsia="Microsoft YaHei"/>
-        </w:rPr>
-        <w:t>将原始距离与 LOEO 校准残差并列为核心方法贡献。</w:t>
-      </w:r>
-    </w:p>
-    <w:p>
-      <w:pPr>
-        <w:pStyle w:val="ListNumber"/>
-        <w:ind w:left="397"/>
-      </w:pPr>
-      <w:r>
-        <w:rPr>
-          <w:rFonts w:ascii="Microsoft YaHei" w:hAnsi="Microsoft YaHei" w:eastAsia="Microsoft YaHei"/>
-        </w:rPr>
-        <w:t>静态图进入正文，Web 3D 模型作为补充材料或答辩展示。</w:t>
-      </w:r>
-    </w:p>
-    <w:p>
-      <w:pPr>
-        <w:pStyle w:val="ListNumber"/>
-        <w:ind w:left="397"/>
-      </w:pPr>
-      <w:r>
-        <w:rPr>
-          <w:rFonts w:ascii="Microsoft YaHei" w:hAnsi="Microsoft YaHei" w:eastAsia="Microsoft YaHei"/>
-        </w:rPr>
-        <w:t>生理结果放入探索性分析，不作为论文主结论。</w:t>
-      </w:r>
-    </w:p>
-    <w:p>
-      <w:pPr>
-        <w:pStyle w:val="ListNumber"/>
-        <w:ind w:left="397"/>
-      </w:pPr>
-      <w:r>
-        <w:rPr>
-          <w:rFonts w:ascii="Microsoft YaHei" w:hAnsi="Microsoft YaHei" w:eastAsia="Microsoft YaHei"/>
-        </w:rPr>
-        <w:t>按探索性研究标准撰写摘要、方法、结果、讨论和可复现性声明。</w:t>
-      </w:r>
     </w:p>
     <w:p>
       <w:pPr>
@@ -3515,43 +6530,7 @@
         <w:rPr>
           <w:rFonts w:ascii="Microsoft YaHei" w:hAnsi="Microsoft YaHei" w:eastAsia="Microsoft YaHei"/>
         </w:rPr>
-        <w:t>暂不建议在本月展开</w:t>
-      </w:r>
-    </w:p>
-    <w:p>
-      <w:pPr>
-        <w:pStyle w:val="ListBullet"/>
-        <w:ind w:left="397"/>
-      </w:pPr>
-      <w:r>
-        <w:rPr>
-          <w:rFonts w:ascii="Microsoft YaHei" w:hAnsi="Microsoft YaHei" w:eastAsia="Microsoft YaHei"/>
-        </w:rPr>
-        <w:t>新招募大样本并采集三层 VAD 与生理信号。</w:t>
-      </w:r>
-    </w:p>
-    <w:p>
-      <w:pPr>
-        <w:pStyle w:val="ListBullet"/>
-        <w:ind w:left="397"/>
-      </w:pPr>
-      <w:r>
-        <w:rPr>
-          <w:rFonts w:ascii="Microsoft YaHei" w:hAnsi="Microsoft YaHei" w:eastAsia="Microsoft YaHei"/>
-        </w:rPr>
-        <w:t>训练复杂的深度生理情绪识别模型。</w:t>
-      </w:r>
-    </w:p>
-    <w:p>
-      <w:pPr>
-        <w:pStyle w:val="ListBullet"/>
-        <w:ind w:left="397"/>
-      </w:pPr>
-      <w:r>
-        <w:rPr>
-          <w:rFonts w:ascii="Microsoft YaHei" w:hAnsi="Microsoft YaHei" w:eastAsia="Microsoft YaHei"/>
-        </w:rPr>
-        <w:t>扩展到上百种复杂情绪并声称可以从少量锚点可靠推断全部坐标。</w:t>
+        <w:t>9.3 当前一个月最合理的产出</w:t>
       </w:r>
     </w:p>
     <w:p>
@@ -3562,7 +6541,7 @@
         <w:rPr>
           <w:rFonts w:ascii="Microsoft YaHei" w:hAnsi="Microsoft YaHei" w:eastAsia="Microsoft YaHei"/>
         </w:rPr>
-        <w:t>这些方向需要伦理、设备、刺激验证和更大样本，应作为后续研究，而不是挤入当前论文周期。</w:t>
+        <w:t>不是新建数据库或启动新实验，而是完成一篇边界清楚的探索性论文。该论文能够回答"跨情境情绪VAD结构如何对应和偏离"，同时把"同一参与者三层直接对齐及其生理机制"保留为下一阶段更强的验证研究。</w:t>
       </w:r>
     </w:p>
     <w:p>
@@ -3595,6 +6574,26 @@
         </w:rPr>
         <w:t>analysis/dreamer_nrc_pilot.py</w:t>
       </w:r>
+      <w:r>
+        <w:rPr>
+          <w:rFonts w:ascii="Microsoft YaHei" w:hAnsi="Microsoft YaHei" w:eastAsia="Microsoft YaHei"/>
+        </w:rPr>
+        <w:t>（主分析）、</w:t>
+      </w:r>
+      <w:r>
+        <w:rPr>
+          <w:rFonts w:ascii="Consolas" w:hAnsi="Consolas" w:eastAsia="Consolas"/>
+          <w:color w:val="287B78"/>
+          <w:sz w:val="18"/>
+        </w:rPr>
+        <w:t>analysis/dreamer_nrc_robustness.py</w:t>
+      </w:r>
+      <w:r>
+        <w:rPr>
+          <w:rFonts w:ascii="Microsoft YaHei" w:hAnsi="Microsoft YaHei" w:eastAsia="Microsoft YaHei"/>
+        </w:rPr>
+        <w:t>（稳健性复核）</w:t>
+      </w:r>
     </w:p>
     <w:p>
       <w:pPr>
@@ -3625,7 +6624,15 @@
         <w:rPr>
           <w:rFonts w:ascii="Microsoft YaHei" w:hAnsi="Microsoft YaHei" w:eastAsia="Microsoft YaHei"/>
         </w:rPr>
-        <w:t>试次评分、类别汇总、相关、校准、生理特征与模型结果 CSV</w:t>
+        <w:t>论文级四图（维度对齐、量尺压缩、影响诊断、校准残差）：</w:t>
+      </w:r>
+      <w:r>
+        <w:rPr>
+          <w:rFonts w:ascii="Consolas" w:hAnsi="Consolas" w:eastAsia="Consolas"/>
+          <w:color w:val="287B78"/>
+          <w:sz w:val="18"/>
+        </w:rPr>
+        <w:t>results/dreamer_nrc_robustness/figure_*.png/svg</w:t>
       </w:r>
     </w:p>
     <w:p>
@@ -3637,7 +6644,31 @@
         <w:rPr>
           <w:rFonts w:ascii="Microsoft YaHei" w:hAnsi="Microsoft YaHei" w:eastAsia="Microsoft YaHei"/>
         </w:rPr>
-        <w:t>DREAMER-NRC 复跑报告与 CASE 可行性报告</w:t>
+        <w:t>试次评分、类别汇总、相关、校准残差、生理特征与模型结果 CSV</w:t>
+      </w:r>
+    </w:p>
+    <w:p>
+      <w:pPr>
+        <w:pStyle w:val="ListBullet"/>
+        <w:ind w:left="397"/>
+      </w:pPr>
+      <w:r>
+        <w:rPr>
+          <w:rFonts w:ascii="Microsoft YaHei" w:hAnsi="Microsoft YaHei" w:eastAsia="Microsoft YaHei"/>
+        </w:rPr>
+        <w:t>DREAMER-NRC 复跑报告 + 稳健性分析报告（含全部9!置换、bootstrap、逐类删除结果）</w:t>
+      </w:r>
+    </w:p>
+    <w:p>
+      <w:pPr>
+        <w:pStyle w:val="ListBullet"/>
+        <w:ind w:left="397"/>
+      </w:pPr>
+      <w:r>
+        <w:rPr>
+          <w:rFonts w:ascii="Microsoft YaHei" w:hAnsi="Microsoft YaHei" w:eastAsia="Microsoft YaHei"/>
+        </w:rPr>
+        <w:t>CASE 可行性报告 + CASE 恢复曲线方法试跑</w:t>
       </w:r>
     </w:p>
     <w:p>
@@ -3661,7 +6692,7 @@
         <w:rPr>
           <w:rFonts w:ascii="Microsoft YaHei" w:hAnsi="Microsoft YaHei" w:eastAsia="Microsoft YaHei"/>
         </w:rPr>
-        <w:t>论文数据前稿、详细提纲、审稿人视角评估和本进展报告</w:t>
+        <w:t>论文数据前稿、详细提纲、审稿人视角评估、研究概要书和本进展报告</w:t>
       </w:r>
     </w:p>
     <w:p>
@@ -3683,7 +6714,64 @@
         <w:rPr>
           <w:rFonts w:ascii="Microsoft YaHei" w:hAnsi="Microsoft YaHei" w:eastAsia="Microsoft YaHei"/>
         </w:rPr>
-        <w:t>当前项目已经从“想法是否有意义”推进到“已有公开数据、可复现分析和明确结果”的阶段。最可靠的发现是：情绪词与诱发体验在 Valence 上共享结构，在 Arousal 上存在整体对应但伴随压缩和重排，在 Dominance 上暂未形成可靠对应。不同情绪确实表现出不同程度的重合与偏离，但必须区分原始坐标距离和校准后的特异性残差。</w:t>
+        <w:t>当前项目已经从”想法是否有意义”推进到”已有公开数据、可复现分析、完整稳健性复核和明确结果”的阶段。三层关键发现构成了递进的维度特异性证据：</w:t>
+      </w:r>
+    </w:p>
+    <w:p>
+      <w:pPr>
+        <w:pStyle w:val="ListNumber"/>
+        <w:ind w:left="397"/>
+      </w:pPr>
+      <w:r>
+        <w:rPr>
+          <w:rFonts w:ascii="Microsoft YaHei" w:hAnsi="Microsoft YaHei" w:eastAsia="Microsoft YaHei"/>
+          <w:b/>
+        </w:rPr>
+        <w:t>Valence</w:t>
+      </w:r>
+      <w:r>
+        <w:rPr>
+          <w:rFonts w:ascii="Microsoft YaHei" w:hAnsi="Microsoft YaHei" w:eastAsia="Microsoft YaHei"/>
+        </w:rPr>
+        <w:t>：强且稳定的跨情境对应（r=.875, Holm p=.018, 全置换+双层bootstrap+逐类删除均稳健）。这是目前最可靠的跨情境桥梁。</w:t>
+      </w:r>
+    </w:p>
+    <w:p>
+      <w:pPr>
+        <w:pStyle w:val="ListNumber"/>
+        <w:ind w:left="397"/>
+      </w:pPr>
+      <w:r>
+        <w:rPr>
+          <w:rFonts w:ascii="Microsoft YaHei" w:hAnsi="Microsoft YaHei" w:eastAsia="Microsoft YaHei"/>
+          <w:b/>
+        </w:rPr>
+        <w:t>Arousal</w:t>
+      </w:r>
+      <w:r>
+        <w:rPr>
+          <w:rFonts w:ascii="Microsoft YaHei" w:hAnsi="Microsoft YaHei" w:eastAsia="Microsoft YaHei"/>
+        </w:rPr>
+        <w:t>：保留线性趋势（r=.832, Holm p=.034）但秩相关不稳定、依赖calmness等单类、诱发评分范围明显压缩。可跨情境使用，但需要校准。</w:t>
+      </w:r>
+    </w:p>
+    <w:p>
+      <w:pPr>
+        <w:pStyle w:val="ListNumber"/>
+        <w:ind w:left="397"/>
+      </w:pPr>
+      <w:r>
+        <w:rPr>
+          <w:rFonts w:ascii="Microsoft YaHei" w:hAnsi="Microsoft YaHei" w:eastAsia="Microsoft YaHei"/>
+          <w:b/>
+        </w:rPr>
+        <w:t>Dominance</w:t>
+      </w:r>
+      <w:r>
+        <w:rPr>
+          <w:rFonts w:ascii="Microsoft YaHei" w:hAnsi="Microsoft YaHei" w:eastAsia="Microsoft YaHei"/>
+        </w:rPr>
+        <w:t>：未发现跨情境对应（r=-.121, Holm p=.792）。FAA→Dominance的特异性假设在DREAMER低密度EEG条件下未获支持，需更高密度设备验证。</w:t>
       </w:r>
     </w:p>
     <w:p>
@@ -3694,7 +6782,31 @@
         <w:rPr>
           <w:rFonts w:ascii="Microsoft YaHei" w:hAnsi="Microsoft YaHei" w:eastAsia="Microsoft YaHei"/>
         </w:rPr>
-        <w:t>因此，一个月内最合理的产出不是新建数据库，而是完成一篇边界清楚的探索性论文。该论文能够回答“跨语境情绪 VAD 结构如何对应和偏离”，同时把“同一参与者三层直接对齐及其生理机制”保留为下一阶段更强的验证研究。</w:t>
+        <w:t>方法上，本研究建立了”结构相关→全局量尺映射→校准类别残差”的三步审计框架，并被CASE二维复现验证可跨数据库迁移。不同数据库的一致性（Valence方向）和分歧（Dominance的跨库缺失、类别覆盖差异）已通过横向对比表格系统化呈现。</w:t>
+      </w:r>
+    </w:p>
+    <w:p>
+      <w:pPr>
+        <w:ind w:firstLine="420"/>
+      </w:pPr>
+      <w:r>
+        <w:rPr>
+          <w:rFonts w:ascii="Microsoft YaHei" w:hAnsi="Microsoft YaHei" w:eastAsia="Microsoft YaHei"/>
+        </w:rPr>
+        <w:t>因此，一个月内最合理的产出不是新建数据库或启动新实验，而是</w:t>
+      </w:r>
+      <w:r>
+        <w:rPr>
+          <w:rFonts w:ascii="Microsoft YaHei" w:hAnsi="Microsoft YaHei" w:eastAsia="Microsoft YaHei"/>
+          <w:b/>
+        </w:rPr>
+        <w:t>完成一篇边界清楚的探索性论文</w:t>
+      </w:r>
+      <w:r>
+        <w:rPr>
+          <w:rFonts w:ascii="Microsoft YaHei" w:hAnsi="Microsoft YaHei" w:eastAsia="Microsoft YaHei"/>
+        </w:rPr>
+        <w:t>。该论文能够回答”跨情境情绪VAD结构如何对应和偏离”，同时把”A2同一参与者三层直接对齐及其FAA→Dominance等生理机制”保留为下一阶段更强、更精确的验证研究。A2实验的全部设计文档已完成，一旦伦理审批、设备确认和参与者招募三个前置条件就绪，即可从设计阶段转入执行阶段。</w:t>
       </w:r>
     </w:p>
     <w:p>

</xml_diff>